<commit_message>
Add smoothed 12-point trajectories with second-derivative inflection analysis
Smooth the vigor, fatigue and total mood disturbance signals over the
twelve pre/post-training points with a spline, remove the noise, and
locate each curve's inflection point from the second derivative. Add a
thick thematic three-panel figure that signals the raw signal, the
smoothed curve, the inflection, the extrema and the week phases, plus a
new results subsection and a table of inflection points and extrema.

Co-Authored-By: Claude Opus 4.8 <noreply@anthropic.com>
Claude-Session: https://claude.ai/code/session_01P7yGiDeoGDyjWvPWQVsUrj
</commit_message>
<xml_diff>
--- a/Artigos/Paper1_Humor_MDPI.docx
+++ b/Artigos/Paper1_Humor_MDPI.docx
@@ -7371,7 +7371,7 @@
           <w:b/>
           <w:sz w:val="20"/>
         </w:rPr>
-        <w:t>3.5. Dias de Pico e Comparação de Cada Dia ao Primeiro</w:t>
+        <w:t>3.5. Suavização das Trajetórias e Limites das Segundas Derivadas</w:t>
       </w:r>
     </w:p>
     <w:p>
@@ -7387,7 +7387,68 @@
           <w:i w:val="0"/>
           <w:sz w:val="20"/>
         </w:rPr>
-        <w:t>A localização dos picos sintetiza a dinâmica semanal (Tabela 7): o vigor foi máximo no Dia 1 e mínimo no Dia 7, ao passo que a fadiga foi máxima no Dia 7. O início da semana reúne maior prontidão e o final concentra a fadiga e a raiva.</w:t>
+        <w:t>Para separar o sinal do ruído, as trajetórias do vigor, da fadiga e da PTH foram suavizadas sobre os doze pontos pré e pós-treino por meio de uma spline, e a segunda derivada de cada curva localizou o seu ponto de inflexão, ou seja, o momento em que a concavidade muda e a taxa de variação atinge o seu limite (Figura 6; Tabela 7). Depois de removido o ruído, cada dimensão exibiu um único ponto de inflexão, situado na metade da semana (em torno do Dia 3,8), o que marca a transição entre a fase inicial de prontidão e a fase de acúmulo de carga. A curva suavizada do vigor subiu até um máximo em torno do Dia 5,0 e caiu para o seu mínimo ao fim da semana, enquanto a fadiga e a PTH percorreram o caminho inverso e atingiram os seus máximos no último dia.</w:t>
+      </w:r>
+    </w:p>
+    <w:p>
+      <w:pPr>
+        <w:spacing w:before="120"/>
+        <w:jc w:val="center"/>
+      </w:pPr>
+      <w:r>
+        <w:drawing>
+          <wp:inline xmlns:a="http://schemas.openxmlformats.org/drawingml/2006/main" xmlns:pic="http://schemas.openxmlformats.org/drawingml/2006/picture">
+            <wp:extent cx="5400000" cy="4248000"/>
+            <wp:docPr id="6" name="Picture 6"/>
+            <wp:cNvGraphicFramePr>
+              <a:graphicFrameLocks noChangeAspect="1"/>
+            </wp:cNvGraphicFramePr>
+            <a:graphic>
+              <a:graphicData uri="http://schemas.openxmlformats.org/drawingml/2006/picture">
+                <pic:pic>
+                  <pic:nvPicPr>
+                    <pic:cNvPr id="0" name="smooth_deriv.png"/>
+                    <pic:cNvPicPr/>
+                  </pic:nvPicPr>
+                  <pic:blipFill>
+                    <a:blip r:embed="rId14"/>
+                    <a:stretch>
+                      <a:fillRect/>
+                    </a:stretch>
+                  </pic:blipFill>
+                  <pic:spPr>
+                    <a:xfrm>
+                      <a:off x="0" y="0"/>
+                      <a:ext cx="5400000" cy="4248000"/>
+                    </a:xfrm>
+                    <a:prstGeom prst="rect"/>
+                  </pic:spPr>
+                </pic:pic>
+              </a:graphicData>
+            </a:graphic>
+          </wp:inline>
+        </w:drawing>
+      </w:r>
+    </w:p>
+    <w:p>
+      <w:pPr>
+        <w:spacing w:after="120"/>
+        <w:jc w:val="center"/>
+      </w:pPr>
+      <w:r>
+        <w:rPr>
+          <w:rFonts w:ascii="Palatino Linotype" w:hAnsi="Palatino Linotype"/>
+          <w:b/>
+          <w:sz w:val="18"/>
+        </w:rPr>
+        <w:t xml:space="preserve">Figura 6. </w:t>
+      </w:r>
+      <w:r>
+        <w:rPr>
+          <w:rFonts w:ascii="Palatino Linotype" w:hAnsi="Palatino Linotype"/>
+          <w:sz w:val="18"/>
+        </w:rPr>
+        <w:t>Trajetórias suavizadas do vigor, da fadiga e da PTH sobre os doze pontos pré e pós-treino. Marcadores translúcidos: sinal bruto; linha grossa: sinal suavizado; linha pontilhada: ponto de inflexão (segunda derivada nula); triângulos: máximo e mínimo. Áreas sombreadas: início e acúmulo da semana.</w:t>
       </w:r>
     </w:p>
     <w:p>
@@ -7402,6 +7463,484 @@
           <w:sz w:val="18"/>
         </w:rPr>
         <w:t xml:space="preserve">Tabela 7. </w:t>
+      </w:r>
+      <w:r>
+        <w:rPr>
+          <w:rFonts w:ascii="Palatino Linotype" w:hAnsi="Palatino Linotype"/>
+          <w:sz w:val="18"/>
+        </w:rPr>
+        <w:t>Ponto de inflexão (segunda derivada nula) e extremos das trajetórias suavizadas do eixo energia–fadiga.</w:t>
+      </w:r>
+    </w:p>
+    <w:tbl>
+      <w:tblPr>
+        <w:tblW w:type="auto" w:w="0"/>
+        <w:jc w:val="center"/>
+        <w:tblLayout w:type="fixed"/>
+        <w:tblLook w:firstColumn="1" w:firstRow="1" w:lastColumn="0" w:lastRow="0" w:noHBand="0" w:noVBand="1" w:val="04A0"/>
+        <w:tblLayout w:type="fixed"/>
+        <w:tblCellMar>
+          <w:left w:w="40" w:type="dxa"/>
+          <w:right w:w="40" w:type="dxa"/>
+        </w:tblCellMar>
+      </w:tblPr>
+      <w:tblGrid>
+        <w:gridCol w:w="1757"/>
+        <w:gridCol w:w="3146"/>
+        <w:gridCol w:w="3146"/>
+        <w:gridCol w:w="1587"/>
+      </w:tblGrid>
+      <w:tr>
+        <w:tc>
+          <w:tcPr>
+            <w:tcW w:type="dxa" w:w="1757"/>
+            <w:tcBorders>
+              <w:top w:val="single" w:sz="6" w:color="000000"/>
+              <w:bottom w:val="single" w:sz="6" w:color="000000"/>
+              <w:left w:val="nil" w:sz="6" w:color="000000"/>
+              <w:right w:val="nil" w:sz="6" w:color="000000"/>
+            </w:tcBorders>
+          </w:tcPr>
+          <w:p>
+            <w:pPr>
+              <w:jc w:val="center"/>
+            </w:pPr>
+            <w:r/>
+            <w:r>
+              <w:rPr>
+                <w:rFonts w:ascii="Palatino Linotype" w:hAnsi="Palatino Linotype"/>
+                <w:b/>
+                <w:sz w:val="17"/>
+              </w:rPr>
+              <w:t>Dimensão</w:t>
+            </w:r>
+          </w:p>
+        </w:tc>
+        <w:tc>
+          <w:tcPr>
+            <w:tcW w:type="dxa" w:w="3146"/>
+            <w:tcBorders>
+              <w:top w:val="single" w:sz="6" w:color="000000"/>
+              <w:bottom w:val="single" w:sz="6" w:color="000000"/>
+              <w:left w:val="nil" w:sz="6" w:color="000000"/>
+              <w:right w:val="nil" w:sz="6" w:color="000000"/>
+            </w:tcBorders>
+          </w:tcPr>
+          <w:p>
+            <w:pPr>
+              <w:jc w:val="center"/>
+            </w:pPr>
+            <w:r/>
+            <w:r>
+              <w:rPr>
+                <w:rFonts w:ascii="Palatino Linotype" w:hAnsi="Palatino Linotype"/>
+                <w:b/>
+                <w:sz w:val="17"/>
+              </w:rPr>
+              <w:t>Inflexão (dia)</w:t>
+            </w:r>
+          </w:p>
+        </w:tc>
+        <w:tc>
+          <w:tcPr>
+            <w:tcW w:type="dxa" w:w="3146"/>
+            <w:tcBorders>
+              <w:top w:val="single" w:sz="6" w:color="000000"/>
+              <w:bottom w:val="single" w:sz="6" w:color="000000"/>
+              <w:left w:val="nil" w:sz="6" w:color="000000"/>
+              <w:right w:val="nil" w:sz="6" w:color="000000"/>
+            </w:tcBorders>
+          </w:tcPr>
+          <w:p>
+            <w:pPr>
+              <w:jc w:val="center"/>
+            </w:pPr>
+            <w:r/>
+            <w:r>
+              <w:rPr>
+                <w:rFonts w:ascii="Palatino Linotype" w:hAnsi="Palatino Linotype"/>
+                <w:b/>
+                <w:sz w:val="17"/>
+              </w:rPr>
+              <w:t>Máximo: dia (escore)</w:t>
+            </w:r>
+          </w:p>
+        </w:tc>
+        <w:tc>
+          <w:tcPr>
+            <w:tcW w:type="dxa" w:w="1587"/>
+            <w:tcBorders>
+              <w:top w:val="single" w:sz="6" w:color="000000"/>
+              <w:bottom w:val="single" w:sz="6" w:color="000000"/>
+              <w:left w:val="nil" w:sz="6" w:color="000000"/>
+              <w:right w:val="nil" w:sz="6" w:color="000000"/>
+            </w:tcBorders>
+          </w:tcPr>
+          <w:p>
+            <w:pPr>
+              <w:jc w:val="center"/>
+            </w:pPr>
+            <w:r/>
+            <w:r>
+              <w:rPr>
+                <w:rFonts w:ascii="Palatino Linotype" w:hAnsi="Palatino Linotype"/>
+                <w:b/>
+                <w:sz w:val="17"/>
+              </w:rPr>
+              <w:t>Mínimo: dia (escore)</w:t>
+            </w:r>
+          </w:p>
+        </w:tc>
+      </w:tr>
+      <w:tr>
+        <w:tc>
+          <w:tcPr>
+            <w:tcW w:type="dxa" w:w="1757"/>
+            <w:tcBorders>
+              <w:top w:val="single" w:sz="6" w:color="000000"/>
+              <w:bottom w:val="single" w:sz="6" w:color="000000"/>
+              <w:left w:val="nil" w:sz="6" w:color="000000"/>
+              <w:right w:val="nil" w:sz="6" w:color="000000"/>
+            </w:tcBorders>
+          </w:tcPr>
+          <w:p>
+            <w:pPr>
+              <w:jc w:val="left"/>
+            </w:pPr>
+            <w:r/>
+            <w:r>
+              <w:rPr>
+                <w:rFonts w:ascii="Palatino Linotype" w:hAnsi="Palatino Linotype"/>
+                <w:sz w:val="17"/>
+              </w:rPr>
+              <w:t>Vigor</w:t>
+            </w:r>
+          </w:p>
+        </w:tc>
+        <w:tc>
+          <w:tcPr>
+            <w:tcW w:type="dxa" w:w="3146"/>
+            <w:tcBorders>
+              <w:top w:val="single" w:sz="6" w:color="000000"/>
+              <w:bottom w:val="single" w:sz="6" w:color="000000"/>
+              <w:left w:val="nil" w:sz="6" w:color="000000"/>
+              <w:right w:val="nil" w:sz="6" w:color="000000"/>
+            </w:tcBorders>
+          </w:tcPr>
+          <w:p>
+            <w:pPr>
+              <w:jc w:val="center"/>
+            </w:pPr>
+            <w:r/>
+            <w:r>
+              <w:rPr>
+                <w:rFonts w:ascii="Palatino Linotype" w:hAnsi="Palatino Linotype"/>
+                <w:sz w:val="17"/>
+              </w:rPr>
+              <w:t>Dia 3,8</w:t>
+            </w:r>
+          </w:p>
+        </w:tc>
+        <w:tc>
+          <w:tcPr>
+            <w:tcW w:type="dxa" w:w="3146"/>
+            <w:tcBorders>
+              <w:top w:val="single" w:sz="6" w:color="000000"/>
+              <w:bottom w:val="single" w:sz="6" w:color="000000"/>
+              <w:left w:val="nil" w:sz="6" w:color="000000"/>
+              <w:right w:val="nil" w:sz="6" w:color="000000"/>
+            </w:tcBorders>
+          </w:tcPr>
+          <w:p>
+            <w:pPr>
+              <w:jc w:val="center"/>
+            </w:pPr>
+            <w:r/>
+            <w:r>
+              <w:rPr>
+                <w:rFonts w:ascii="Palatino Linotype" w:hAnsi="Palatino Linotype"/>
+                <w:sz w:val="17"/>
+              </w:rPr>
+              <w:t>Dia 5,0 (5,9)</w:t>
+            </w:r>
+          </w:p>
+        </w:tc>
+        <w:tc>
+          <w:tcPr>
+            <w:tcW w:type="dxa" w:w="1587"/>
+            <w:tcBorders>
+              <w:top w:val="single" w:sz="6" w:color="000000"/>
+              <w:bottom w:val="single" w:sz="6" w:color="000000"/>
+              <w:left w:val="nil" w:sz="6" w:color="000000"/>
+              <w:right w:val="nil" w:sz="6" w:color="000000"/>
+            </w:tcBorders>
+          </w:tcPr>
+          <w:p>
+            <w:pPr>
+              <w:jc w:val="center"/>
+            </w:pPr>
+            <w:r/>
+            <w:r>
+              <w:rPr>
+                <w:rFonts w:ascii="Palatino Linotype" w:hAnsi="Palatino Linotype"/>
+                <w:sz w:val="17"/>
+              </w:rPr>
+              <w:t>Dia 7,2 (4,2)</w:t>
+            </w:r>
+          </w:p>
+        </w:tc>
+      </w:tr>
+      <w:tr>
+        <w:tc>
+          <w:tcPr>
+            <w:tcW w:type="dxa" w:w="1757"/>
+            <w:tcBorders>
+              <w:top w:val="single" w:sz="6" w:color="000000"/>
+              <w:bottom w:val="single" w:sz="6" w:color="000000"/>
+              <w:left w:val="nil" w:sz="6" w:color="000000"/>
+              <w:right w:val="nil" w:sz="6" w:color="000000"/>
+            </w:tcBorders>
+          </w:tcPr>
+          <w:p>
+            <w:pPr>
+              <w:jc w:val="left"/>
+            </w:pPr>
+            <w:r/>
+            <w:r>
+              <w:rPr>
+                <w:rFonts w:ascii="Palatino Linotype" w:hAnsi="Palatino Linotype"/>
+                <w:sz w:val="17"/>
+              </w:rPr>
+              <w:t>Fadiga</w:t>
+            </w:r>
+          </w:p>
+        </w:tc>
+        <w:tc>
+          <w:tcPr>
+            <w:tcW w:type="dxa" w:w="3146"/>
+            <w:tcBorders>
+              <w:top w:val="single" w:sz="6" w:color="000000"/>
+              <w:bottom w:val="single" w:sz="6" w:color="000000"/>
+              <w:left w:val="nil" w:sz="6" w:color="000000"/>
+              <w:right w:val="nil" w:sz="6" w:color="000000"/>
+            </w:tcBorders>
+          </w:tcPr>
+          <w:p>
+            <w:pPr>
+              <w:jc w:val="center"/>
+            </w:pPr>
+            <w:r/>
+            <w:r>
+              <w:rPr>
+                <w:rFonts w:ascii="Palatino Linotype" w:hAnsi="Palatino Linotype"/>
+                <w:sz w:val="17"/>
+              </w:rPr>
+              <w:t>Dia 3,8</w:t>
+            </w:r>
+          </w:p>
+        </w:tc>
+        <w:tc>
+          <w:tcPr>
+            <w:tcW w:type="dxa" w:w="3146"/>
+            <w:tcBorders>
+              <w:top w:val="single" w:sz="6" w:color="000000"/>
+              <w:bottom w:val="single" w:sz="6" w:color="000000"/>
+              <w:left w:val="nil" w:sz="6" w:color="000000"/>
+              <w:right w:val="nil" w:sz="6" w:color="000000"/>
+            </w:tcBorders>
+          </w:tcPr>
+          <w:p>
+            <w:pPr>
+              <w:jc w:val="center"/>
+            </w:pPr>
+            <w:r/>
+            <w:r>
+              <w:rPr>
+                <w:rFonts w:ascii="Palatino Linotype" w:hAnsi="Palatino Linotype"/>
+                <w:sz w:val="17"/>
+              </w:rPr>
+              <w:t>Dia 7,2 (7,7)</w:t>
+            </w:r>
+          </w:p>
+        </w:tc>
+        <w:tc>
+          <w:tcPr>
+            <w:tcW w:type="dxa" w:w="1587"/>
+            <w:tcBorders>
+              <w:top w:val="single" w:sz="6" w:color="000000"/>
+              <w:bottom w:val="single" w:sz="6" w:color="000000"/>
+              <w:left w:val="nil" w:sz="6" w:color="000000"/>
+              <w:right w:val="nil" w:sz="6" w:color="000000"/>
+            </w:tcBorders>
+          </w:tcPr>
+          <w:p>
+            <w:pPr>
+              <w:jc w:val="center"/>
+            </w:pPr>
+            <w:r/>
+            <w:r>
+              <w:rPr>
+                <w:rFonts w:ascii="Palatino Linotype" w:hAnsi="Palatino Linotype"/>
+                <w:sz w:val="17"/>
+              </w:rPr>
+              <w:t>Dia 1,8 (4,5)</w:t>
+            </w:r>
+          </w:p>
+        </w:tc>
+      </w:tr>
+      <w:tr>
+        <w:tc>
+          <w:tcPr>
+            <w:tcW w:type="dxa" w:w="1757"/>
+            <w:tcBorders>
+              <w:top w:val="single" w:sz="6" w:color="000000"/>
+              <w:bottom w:val="single" w:sz="6" w:color="000000"/>
+              <w:left w:val="nil" w:sz="6" w:color="000000"/>
+              <w:right w:val="nil" w:sz="6" w:color="000000"/>
+            </w:tcBorders>
+          </w:tcPr>
+          <w:p>
+            <w:pPr>
+              <w:jc w:val="left"/>
+            </w:pPr>
+            <w:r/>
+            <w:r>
+              <w:rPr>
+                <w:rFonts w:ascii="Palatino Linotype" w:hAnsi="Palatino Linotype"/>
+                <w:sz w:val="17"/>
+              </w:rPr>
+              <w:t>PTH</w:t>
+            </w:r>
+          </w:p>
+        </w:tc>
+        <w:tc>
+          <w:tcPr>
+            <w:tcW w:type="dxa" w:w="3146"/>
+            <w:tcBorders>
+              <w:top w:val="single" w:sz="6" w:color="000000"/>
+              <w:bottom w:val="single" w:sz="6" w:color="000000"/>
+              <w:left w:val="nil" w:sz="6" w:color="000000"/>
+              <w:right w:val="nil" w:sz="6" w:color="000000"/>
+            </w:tcBorders>
+          </w:tcPr>
+          <w:p>
+            <w:pPr>
+              <w:jc w:val="center"/>
+            </w:pPr>
+            <w:r/>
+            <w:r>
+              <w:rPr>
+                <w:rFonts w:ascii="Palatino Linotype" w:hAnsi="Palatino Linotype"/>
+                <w:sz w:val="17"/>
+              </w:rPr>
+              <w:t>Dia 3,5</w:t>
+            </w:r>
+          </w:p>
+        </w:tc>
+        <w:tc>
+          <w:tcPr>
+            <w:tcW w:type="dxa" w:w="3146"/>
+            <w:tcBorders>
+              <w:top w:val="single" w:sz="6" w:color="000000"/>
+              <w:bottom w:val="single" w:sz="6" w:color="000000"/>
+              <w:left w:val="nil" w:sz="6" w:color="000000"/>
+              <w:right w:val="nil" w:sz="6" w:color="000000"/>
+            </w:tcBorders>
+          </w:tcPr>
+          <w:p>
+            <w:pPr>
+              <w:jc w:val="center"/>
+            </w:pPr>
+            <w:r/>
+            <w:r>
+              <w:rPr>
+                <w:rFonts w:ascii="Palatino Linotype" w:hAnsi="Palatino Linotype"/>
+                <w:sz w:val="17"/>
+              </w:rPr>
+              <w:t>Dia 7,2 (9,9)</w:t>
+            </w:r>
+          </w:p>
+        </w:tc>
+        <w:tc>
+          <w:tcPr>
+            <w:tcW w:type="dxa" w:w="1587"/>
+            <w:tcBorders>
+              <w:top w:val="single" w:sz="6" w:color="000000"/>
+              <w:bottom w:val="single" w:sz="6" w:color="000000"/>
+              <w:left w:val="nil" w:sz="6" w:color="000000"/>
+              <w:right w:val="nil" w:sz="6" w:color="000000"/>
+            </w:tcBorders>
+          </w:tcPr>
+          <w:p>
+            <w:pPr>
+              <w:jc w:val="center"/>
+            </w:pPr>
+            <w:r/>
+            <w:r>
+              <w:rPr>
+                <w:rFonts w:ascii="Palatino Linotype" w:hAnsi="Palatino Linotype"/>
+                <w:sz w:val="17"/>
+              </w:rPr>
+              <w:t>Dia 4,7 (3,2)</w:t>
+            </w:r>
+          </w:p>
+        </w:tc>
+      </w:tr>
+    </w:tbl>
+    <w:p>
+      <w:pPr>
+        <w:spacing w:after="80"/>
+      </w:pPr>
+      <w:r>
+        <w:rPr>
+          <w:rFonts w:ascii="Palatino Linotype" w:hAnsi="Palatino Linotype"/>
+          <w:i/>
+          <w:sz w:val="16"/>
+        </w:rPr>
+        <w:t>Curvas suavizadas por spline sobre os 12 pontos pré/pós; inflexão = raiz da segunda derivada. PTH: perturbação total do humor.</w:t>
+      </w:r>
+    </w:p>
+    <w:p>
+      <w:pPr>
+        <w:spacing w:before="160" w:after="40" w:line="276" w:lineRule="auto"/>
+      </w:pPr>
+      <w:r>
+        <w:rPr>
+          <w:rFonts w:ascii="Palatino Linotype" w:hAnsi="Palatino Linotype"/>
+          <w:b/>
+          <w:sz w:val="20"/>
+        </w:rPr>
+        <w:t>3.6. Dias de Pico e Comparação de Cada Dia ao Primeiro</w:t>
+      </w:r>
+    </w:p>
+    <w:p>
+      <w:pPr>
+        <w:spacing w:line="276" w:lineRule="auto" w:after="0"/>
+        <w:ind w:firstLine="283"/>
+        <w:jc w:val="both"/>
+      </w:pPr>
+      <w:r>
+        <w:rPr>
+          <w:rFonts w:ascii="Palatino Linotype" w:hAnsi="Palatino Linotype"/>
+          <w:b w:val="0"/>
+          <w:i w:val="0"/>
+          <w:sz w:val="20"/>
+        </w:rPr>
+        <w:t>A localização dos picos sintetiza a dinâmica semanal (Tabela 8): o vigor foi máximo no Dia 1 e mínimo no Dia 7, ao passo que a fadiga foi máxima no Dia 7. O início da semana reúne maior prontidão e o final concentra a fadiga e a raiva.</w:t>
+      </w:r>
+    </w:p>
+    <w:p>
+      <w:pPr>
+        <w:spacing w:before="120" w:after="40"/>
+        <w:jc w:val="both"/>
+      </w:pPr>
+      <w:r>
+        <w:rPr>
+          <w:rFonts w:ascii="Palatino Linotype" w:hAnsi="Palatino Linotype"/>
+          <w:b/>
+          <w:sz w:val="18"/>
+        </w:rPr>
+        <w:t xml:space="preserve">Tabela 8. </w:t>
       </w:r>
       <w:r>
         <w:rPr>
@@ -8308,7 +8847,7 @@
           <w:i w:val="0"/>
           <w:sz w:val="20"/>
         </w:rPr>
-        <w:t>No pós-teste que compara todos os dias entre si (Tabela 8; Figura 6), o vigor diferiu de forma significativa em 9 dos 21 pares de dias e a fadiga em 6, sempre no sentido de piora em relação aos primeiros dias, o que confirma a deterioração progressiva do eixo energia–fadiga.</w:t>
+        <w:t>No pós-teste que compara todos os dias entre si (Tabela 9; Figura 7), o vigor diferiu de forma significativa em 9 dos 21 pares de dias e a fadiga em 6, sempre no sentido de piora em relação aos primeiros dias, o que confirma a deterioração progressiva do eixo energia–fadiga.</w:t>
       </w:r>
     </w:p>
     <w:p>
@@ -8322,7 +8861,7 @@
           <w:b/>
           <w:sz w:val="18"/>
         </w:rPr>
-        <w:t xml:space="preserve">Tabela 8. </w:t>
+        <w:t xml:space="preserve">Tabela 9. </w:t>
       </w:r>
       <w:r>
         <w:rPr>
@@ -8967,7 +9506,7 @@
         <w:drawing>
           <wp:inline xmlns:a="http://schemas.openxmlformats.org/drawingml/2006/main" xmlns:pic="http://schemas.openxmlformats.org/drawingml/2006/picture">
             <wp:extent cx="5220000" cy="2474667"/>
-            <wp:docPr id="6" name="Picture 6"/>
+            <wp:docPr id="7" name="Picture 7"/>
             <wp:cNvGraphicFramePr>
               <a:graphicFrameLocks noChangeAspect="1"/>
             </wp:cNvGraphicFramePr>
@@ -8979,7 +9518,7 @@
                     <pic:cNvPicPr/>
                   </pic:nvPicPr>
                   <pic:blipFill>
-                    <a:blip r:embed="rId14"/>
+                    <a:blip r:embed="rId15"/>
                     <a:stretch>
                       <a:fillRect/>
                     </a:stretch>
@@ -9009,7 +9548,7 @@
           <w:b/>
           <w:sz w:val="18"/>
         </w:rPr>
-        <w:t xml:space="preserve">Figura 6. </w:t>
+        <w:t xml:space="preserve">Figura 7. </w:t>
       </w:r>
       <w:r>
         <w:rPr>
@@ -9029,7 +9568,7 @@
           <w:b/>
           <w:sz w:val="20"/>
         </w:rPr>
-        <w:t>3.6. Variação entre Pré e Pós-Treino</w:t>
+        <w:t>3.7. Variação entre Pré e Pós-Treino</w:t>
       </w:r>
     </w:p>
     <w:p>
@@ -9045,7 +9584,7 @@
           <w:i w:val="0"/>
           <w:sz w:val="20"/>
         </w:rPr>
-        <w:t>O teste de Wilcoxon (Tabela 9) evidenciou uma resposta aguda coerente com o esforço: o vigor caiu (d = -0,47) e a fadiga e a PTH subiram do momento pré para o pós, com efeito de magnitude pequena a moderada.</w:t>
+        <w:t>O teste de Wilcoxon (Tabela 10) evidenciou uma resposta aguda coerente com o esforço: o vigor caiu (d = -0,47) e a fadiga e a PTH subiram do momento pré para o pós, com efeito de magnitude pequena a moderada.</w:t>
       </w:r>
     </w:p>
     <w:p>
@@ -9059,7 +9598,7 @@
           <w:b/>
           <w:sz w:val="18"/>
         </w:rPr>
-        <w:t xml:space="preserve">Tabela 9. </w:t>
+        <w:t xml:space="preserve">Tabela 10. </w:t>
       </w:r>
       <w:r>
         <w:rPr>
@@ -10480,7 +11019,7 @@
         <w:drawing>
           <wp:inline xmlns:a="http://schemas.openxmlformats.org/drawingml/2006/main" xmlns:pic="http://schemas.openxmlformats.org/drawingml/2006/picture">
             <wp:extent cx="5220000" cy="2936250"/>
-            <wp:docPr id="7" name="Picture 7"/>
+            <wp:docPr id="8" name="Picture 8"/>
             <wp:cNvGraphicFramePr>
               <a:graphicFrameLocks noChangeAspect="1"/>
             </wp:cNvGraphicFramePr>
@@ -10492,7 +11031,7 @@
                     <pic:cNvPicPr/>
                   </pic:nvPicPr>
                   <pic:blipFill>
-                    <a:blip r:embed="rId15"/>
+                    <a:blip r:embed="rId16"/>
                     <a:stretch>
                       <a:fillRect/>
                     </a:stretch>
@@ -10522,7 +11061,7 @@
           <w:b/>
           <w:sz w:val="18"/>
         </w:rPr>
-        <w:t xml:space="preserve">Figura 7. </w:t>
+        <w:t xml:space="preserve">Figura 8. </w:t>
       </w:r>
       <w:r>
         <w:rPr>
@@ -10542,7 +11081,7 @@
           <w:b/>
           <w:sz w:val="20"/>
         </w:rPr>
-        <w:t>3.7. Relações entre as Dimensões</w:t>
+        <w:t>3.8. Relações entre as Dimensões</w:t>
       </w:r>
     </w:p>
     <w:p>
@@ -10558,7 +11097,7 @@
           <w:i w:val="0"/>
           <w:sz w:val="20"/>
         </w:rPr>
-        <w:t>As correlações de Spearman (Tabela 10) mostraram que as dimensões negativas se associam entre si, com destaque para os pares depressão–raiva e tensão–confusão, e que a fadiga se relaciona com a depressão e a raiva. O vigor manteve-se relativamente independente, o que reforça a sua leitura como um polo próprio do eixo energia–fadiga.</w:t>
+        <w:t>As correlações de Spearman (Tabela 11) mostraram que as dimensões negativas se associam entre si, com destaque para os pares depressão–raiva e tensão–confusão, e que a fadiga se relaciona com a depressão e a raiva. O vigor manteve-se relativamente independente, o que reforça a sua leitura como um polo próprio do eixo energia–fadiga.</w:t>
       </w:r>
     </w:p>
     <w:p>
@@ -10572,7 +11111,7 @@
           <w:b/>
           <w:sz w:val="18"/>
         </w:rPr>
-        <w:t xml:space="preserve">Tabela 10. </w:t>
+        <w:t xml:space="preserve">Tabela 11. </w:t>
       </w:r>
       <w:r>
         <w:rPr>

</xml_diff>

<commit_message>
Standardize trajectory figures and add smoothing analysis to both papers
Regenerate the daily trajectory, pre/post and marginal-means figures in the
unified thematic style used by the smoothed-derivative figure: thick lines,
consistent per-dimension palette, phase shading, and signaling of extrema,
inflection points and days differing from day one. Add the smoothed
twelve-point second-derivative subsection to the condensed paper so both the
MDPI and condensed versions carry the same standardized figure set. Fix a
noise band that rendered its vertices as stray markers and align the
prevalence table header.

Co-Authored-By: Claude Opus 4.8 <noreply@anthropic.com>
Claude-Session: https://claude.ai/code/session_01P7yGiDeoGDyjWvPWQVsUrj
</commit_message>
<xml_diff>
--- a/Artigos/Paper1_Humor_MDPI.docx
+++ b/Artigos/Paper1_Humor_MDPI.docx
@@ -7247,7 +7247,7 @@
       <w:r>
         <w:drawing>
           <wp:inline xmlns:a="http://schemas.openxmlformats.org/drawingml/2006/main" xmlns:pic="http://schemas.openxmlformats.org/drawingml/2006/picture">
-            <wp:extent cx="5220000" cy="2936250"/>
+            <wp:extent cx="4500000" cy="3540000"/>
             <wp:docPr id="4" name="Picture 4"/>
             <wp:cNvGraphicFramePr>
               <a:graphicFrameLocks noChangeAspect="1"/>
@@ -7268,7 +7268,7 @@
                   <pic:spPr>
                     <a:xfrm>
                       <a:off x="0" y="0"/>
-                      <a:ext cx="5220000" cy="2936250"/>
+                      <a:ext cx="4500000" cy="3540000"/>
                     </a:xfrm>
                     <a:prstGeom prst="rect"/>
                   </pic:spPr>
@@ -7297,7 +7297,7 @@
           <w:rFonts w:ascii="Palatino Linotype" w:hAnsi="Palatino Linotype"/>
           <w:sz w:val="18"/>
         </w:rPr>
-        <w:t>Trajetória de vigor, fadiga e perturbação total do humor ao longo dos sete dias.</w:t>
+        <w:t>Trajetória de vigor, fadiga e perturbação total do humor ao longo dos sete dias (curvas suavizadas; ponto de inflexão e extremos sinalizados).</w:t>
       </w:r>
     </w:p>
     <w:p>
@@ -7398,7 +7398,7 @@
       <w:r>
         <w:drawing>
           <wp:inline xmlns:a="http://schemas.openxmlformats.org/drawingml/2006/main" xmlns:pic="http://schemas.openxmlformats.org/drawingml/2006/picture">
-            <wp:extent cx="5400000" cy="4248000"/>
+            <wp:extent cx="4500000" cy="3540000"/>
             <wp:docPr id="6" name="Picture 6"/>
             <wp:cNvGraphicFramePr>
               <a:graphicFrameLocks noChangeAspect="1"/>
@@ -7419,7 +7419,7 @@
                   <pic:spPr>
                     <a:xfrm>
                       <a:off x="0" y="0"/>
-                      <a:ext cx="5400000" cy="4248000"/>
+                      <a:ext cx="4500000" cy="3540000"/>
                     </a:xfrm>
                     <a:prstGeom prst="rect"/>
                   </pic:spPr>
@@ -9505,7 +9505,7 @@
       <w:r>
         <w:drawing>
           <wp:inline xmlns:a="http://schemas.openxmlformats.org/drawingml/2006/main" xmlns:pic="http://schemas.openxmlformats.org/drawingml/2006/picture">
-            <wp:extent cx="5220000" cy="2474667"/>
+            <wp:extent cx="5220000" cy="2644800"/>
             <wp:docPr id="7" name="Picture 7"/>
             <wp:cNvGraphicFramePr>
               <a:graphicFrameLocks noChangeAspect="1"/>
@@ -9526,7 +9526,7 @@
                   <pic:spPr>
                     <a:xfrm>
                       <a:off x="0" y="0"/>
-                      <a:ext cx="5220000" cy="2474667"/>
+                      <a:ext cx="5220000" cy="2644800"/>
                     </a:xfrm>
                     <a:prstGeom prst="rect"/>
                   </pic:spPr>
@@ -11018,7 +11018,7 @@
       <w:r>
         <w:drawing>
           <wp:inline xmlns:a="http://schemas.openxmlformats.org/drawingml/2006/main" xmlns:pic="http://schemas.openxmlformats.org/drawingml/2006/picture">
-            <wp:extent cx="5220000" cy="2936250"/>
+            <wp:extent cx="4500000" cy="3540000"/>
             <wp:docPr id="8" name="Picture 8"/>
             <wp:cNvGraphicFramePr>
               <a:graphicFrameLocks noChangeAspect="1"/>
@@ -11039,7 +11039,7 @@
                   <pic:spPr>
                     <a:xfrm>
                       <a:off x="0" y="0"/>
-                      <a:ext cx="5220000" cy="2936250"/>
+                      <a:ext cx="4500000" cy="3540000"/>
                     </a:xfrm>
                     <a:prstGeom prst="rect"/>
                   </pic:spPr>

</xml_diff>

<commit_message>
Add significance-bracket box plot and PCA correlation circle to both papers
Refine the two requested figures and include them in the MDPI and condensed
versions: a total mood disturbance box plot across three microcycle days with
capped whiskers, a focused scale and pairwise p-value brackets, and a PCA
correlation circle with thick vivid per-dimension arrows whose width is
proportional to each variable's contribution. Add a between-days paragraph
for the box plot and a new principal component analysis results subsection.

Co-Authored-By: Claude Opus 4.8 <noreply@anthropic.com>
Claude-Session: https://claude.ai/code/session_01P7yGiDeoGDyjWvPWQVsUrj
</commit_message>
<xml_diff>
--- a/Artigos/Paper1_Humor_MDPI.docx
+++ b/Artigos/Paper1_Humor_MDPI.docx
@@ -7363,6 +7363,83 @@
     </w:p>
     <w:p>
       <w:pPr>
+        <w:spacing w:line="276" w:lineRule="auto" w:after="0"/>
+        <w:ind w:firstLine="283"/>
+        <w:jc w:val="both"/>
+      </w:pPr>
+      <w:r>
+        <w:rPr>
+          <w:rFonts w:ascii="Palatino Linotype" w:hAnsi="Palatino Linotype"/>
+          <w:b w:val="0"/>
+          <w:i w:val="0"/>
+          <w:sz w:val="20"/>
+        </w:rPr>
+        <w:t>A comparação direta da PTH entre três momentos do microciclo (Figura 6) ilustra a mesma tendência: a perturbação total do humor aumentou do primeiro para o último dia, e a diferença foi significativa entre o Dia 1 e o Dia 7 (p = 0,008), embora as comparações entre dias adjacentes não tenham alcançado significância.</w:t>
+      </w:r>
+    </w:p>
+    <w:p>
+      <w:pPr>
+        <w:spacing w:before="120"/>
+        <w:jc w:val="center"/>
+      </w:pPr>
+      <w:r>
+        <w:drawing>
+          <wp:inline xmlns:a="http://schemas.openxmlformats.org/drawingml/2006/main" xmlns:pic="http://schemas.openxmlformats.org/drawingml/2006/picture">
+            <wp:extent cx="4680000" cy="3094839"/>
+            <wp:docPr id="6" name="Picture 6"/>
+            <wp:cNvGraphicFramePr>
+              <a:graphicFrameLocks noChangeAspect="1"/>
+            </wp:cNvGraphicFramePr>
+            <a:graphic>
+              <a:graphicData uri="http://schemas.openxmlformats.org/drawingml/2006/picture">
+                <pic:pic>
+                  <pic:nvPicPr>
+                    <pic:cNvPr id="0" name="box_signif.png"/>
+                    <pic:cNvPicPr/>
+                  </pic:nvPicPr>
+                  <pic:blipFill>
+                    <a:blip r:embed="rId14"/>
+                    <a:stretch>
+                      <a:fillRect/>
+                    </a:stretch>
+                  </pic:blipFill>
+                  <pic:spPr>
+                    <a:xfrm>
+                      <a:off x="0" y="0"/>
+                      <a:ext cx="4680000" cy="3094839"/>
+                    </a:xfrm>
+                    <a:prstGeom prst="rect"/>
+                  </pic:spPr>
+                </pic:pic>
+              </a:graphicData>
+            </a:graphic>
+          </wp:inline>
+        </w:drawing>
+      </w:r>
+    </w:p>
+    <w:p>
+      <w:pPr>
+        <w:spacing w:after="120"/>
+        <w:jc w:val="center"/>
+      </w:pPr>
+      <w:r>
+        <w:rPr>
+          <w:rFonts w:ascii="Palatino Linotype" w:hAnsi="Palatino Linotype"/>
+          <w:b/>
+          <w:sz w:val="18"/>
+        </w:rPr>
+        <w:t xml:space="preserve">Figura 6. </w:t>
+      </w:r>
+      <w:r>
+        <w:rPr>
+          <w:rFonts w:ascii="Palatino Linotype" w:hAnsi="Palatino Linotype"/>
+          <w:sz w:val="18"/>
+        </w:rPr>
+        <w:t>Perturbação total do humor (PTH) no Dia 1, no Dia 4 e no Dia 7, com as comparações par a par (teste de Mann-Whitney; * p &lt; 0,05; ** p &lt; 0,01; ns = não significativo).</w:t>
+      </w:r>
+    </w:p>
+    <w:p>
+      <w:pPr>
         <w:spacing w:before="160" w:after="40" w:line="276" w:lineRule="auto"/>
       </w:pPr>
       <w:r>
@@ -7387,7 +7464,7 @@
           <w:i w:val="0"/>
           <w:sz w:val="20"/>
         </w:rPr>
-        <w:t>Para separar o sinal do ruído, as trajetórias do vigor, da fadiga e da PTH foram suavizadas sobre os doze pontos pré e pós-treino por meio de uma spline, e a segunda derivada de cada curva localizou o seu ponto de inflexão, ou seja, o momento em que a concavidade muda e a taxa de variação atinge o seu limite (Figura 6; Tabela 7). Depois de removido o ruído, cada dimensão exibiu um único ponto de inflexão, situado na metade da semana (em torno do Dia 3,8), o que marca a transição entre a fase inicial de prontidão e a fase de acúmulo de carga. A curva suavizada do vigor subiu até um máximo em torno do Dia 5,0 e caiu para o seu mínimo ao fim da semana, enquanto a fadiga e a PTH percorreram o caminho inverso e atingiram os seus máximos no último dia.</w:t>
+        <w:t>Para separar o sinal do ruído, as trajetórias do vigor, da fadiga e da PTH foram suavizadas sobre os doze pontos pré e pós-treino por meio de uma spline, e a segunda derivada de cada curva localizou o seu ponto de inflexão, ou seja, o momento em que a concavidade muda e a taxa de variação atinge o seu limite (Figura 7; Tabela 7). Depois de removido o ruído, cada dimensão exibiu um único ponto de inflexão, situado na metade da semana (em torno do Dia 3,8), o que marca a transição entre a fase inicial de prontidão e a fase de acúmulo de carga. A curva suavizada do vigor subiu até um máximo em torno do Dia 5,0 e caiu para o seu mínimo ao fim da semana, enquanto a fadiga e a PTH percorreram o caminho inverso e atingiram os seus máximos no último dia.</w:t>
       </w:r>
     </w:p>
     <w:p>
@@ -7399,7 +7476,7 @@
         <w:drawing>
           <wp:inline xmlns:a="http://schemas.openxmlformats.org/drawingml/2006/main" xmlns:pic="http://schemas.openxmlformats.org/drawingml/2006/picture">
             <wp:extent cx="4500000" cy="3540000"/>
-            <wp:docPr id="6" name="Picture 6"/>
+            <wp:docPr id="7" name="Picture 7"/>
             <wp:cNvGraphicFramePr>
               <a:graphicFrameLocks noChangeAspect="1"/>
             </wp:cNvGraphicFramePr>
@@ -7411,7 +7488,7 @@
                     <pic:cNvPicPr/>
                   </pic:nvPicPr>
                   <pic:blipFill>
-                    <a:blip r:embed="rId14"/>
+                    <a:blip r:embed="rId15"/>
                     <a:stretch>
                       <a:fillRect/>
                     </a:stretch>
@@ -7441,7 +7518,7 @@
           <w:b/>
           <w:sz w:val="18"/>
         </w:rPr>
-        <w:t xml:space="preserve">Figura 6. </w:t>
+        <w:t xml:space="preserve">Figura 7. </w:t>
       </w:r>
       <w:r>
         <w:rPr>
@@ -8847,7 +8924,7 @@
           <w:i w:val="0"/>
           <w:sz w:val="20"/>
         </w:rPr>
-        <w:t>No pós-teste que compara todos os dias entre si (Tabela 9; Figura 7), o vigor diferiu de forma significativa em 9 dos 21 pares de dias e a fadiga em 6, sempre no sentido de piora em relação aos primeiros dias, o que confirma a deterioração progressiva do eixo energia–fadiga.</w:t>
+        <w:t>No pós-teste que compara todos os dias entre si (Tabela 9; Figura 8), o vigor diferiu de forma significativa em 9 dos 21 pares de dias e a fadiga em 6, sempre no sentido de piora em relação aos primeiros dias, o que confirma a deterioração progressiva do eixo energia–fadiga.</w:t>
       </w:r>
     </w:p>
     <w:p>
@@ -9506,7 +9583,7 @@
         <w:drawing>
           <wp:inline xmlns:a="http://schemas.openxmlformats.org/drawingml/2006/main" xmlns:pic="http://schemas.openxmlformats.org/drawingml/2006/picture">
             <wp:extent cx="5220000" cy="2644800"/>
-            <wp:docPr id="7" name="Picture 7"/>
+            <wp:docPr id="8" name="Picture 8"/>
             <wp:cNvGraphicFramePr>
               <a:graphicFrameLocks noChangeAspect="1"/>
             </wp:cNvGraphicFramePr>
@@ -9518,7 +9595,7 @@
                     <pic:cNvPicPr/>
                   </pic:nvPicPr>
                   <pic:blipFill>
-                    <a:blip r:embed="rId15"/>
+                    <a:blip r:embed="rId16"/>
                     <a:stretch>
                       <a:fillRect/>
                     </a:stretch>
@@ -9548,7 +9625,7 @@
           <w:b/>
           <w:sz w:val="18"/>
         </w:rPr>
-        <w:t xml:space="preserve">Figura 7. </w:t>
+        <w:t xml:space="preserve">Figura 8. </w:t>
       </w:r>
       <w:r>
         <w:rPr>
@@ -11019,7 +11096,7 @@
         <w:drawing>
           <wp:inline xmlns:a="http://schemas.openxmlformats.org/drawingml/2006/main" xmlns:pic="http://schemas.openxmlformats.org/drawingml/2006/picture">
             <wp:extent cx="4500000" cy="3540000"/>
-            <wp:docPr id="8" name="Picture 8"/>
+            <wp:docPr id="9" name="Picture 9"/>
             <wp:cNvGraphicFramePr>
               <a:graphicFrameLocks noChangeAspect="1"/>
             </wp:cNvGraphicFramePr>
@@ -11031,7 +11108,7 @@
                     <pic:cNvPicPr/>
                   </pic:nvPicPr>
                   <pic:blipFill>
-                    <a:blip r:embed="rId16"/>
+                    <a:blip r:embed="rId17"/>
                     <a:stretch>
                       <a:fillRect/>
                     </a:stretch>
@@ -11061,7 +11138,7 @@
           <w:b/>
           <w:sz w:val="18"/>
         </w:rPr>
-        <w:t xml:space="preserve">Figura 8. </w:t>
+        <w:t xml:space="preserve">Figura 9. </w:t>
       </w:r>
       <w:r>
         <w:rPr>
@@ -11671,6 +11748,96 @@
           <w:sz w:val="16"/>
         </w:rPr>
         <w:t>ρ = coeficiente de correlação de Spearman. Apresentam-se apenas os pares com p &lt; 0,05.</w:t>
+      </w:r>
+    </w:p>
+    <w:p>
+      <w:pPr>
+        <w:spacing w:before="160" w:after="40" w:line="276" w:lineRule="auto"/>
+      </w:pPr>
+      <w:r>
+        <w:rPr>
+          <w:rFonts w:ascii="Palatino Linotype" w:hAnsi="Palatino Linotype"/>
+          <w:b/>
+          <w:sz w:val="20"/>
+        </w:rPr>
+        <w:t>3.9. Estrutura Dimensional (Análise de Componentes Principais)</w:t>
+      </w:r>
+    </w:p>
+    <w:p>
+      <w:pPr>
+        <w:spacing w:line="276" w:lineRule="auto" w:after="0"/>
+        <w:ind w:firstLine="283"/>
+        <w:jc w:val="both"/>
+      </w:pPr>
+      <w:r>
+        <w:rPr>
+          <w:rFonts w:ascii="Palatino Linotype" w:hAnsi="Palatino Linotype"/>
+          <w:b w:val="0"/>
+          <w:i w:val="0"/>
+          <w:sz w:val="20"/>
+        </w:rPr>
+        <w:t>Uma análise exploratória de componentes principais resumiu a estrutura das seis dimensões. Os dois primeiros componentes explicaram 64% da variância (41% no primeiro e 23% no segundo). O círculo de correlação (Figura 10) mostra que as dimensões negativas (depressão, raiva, confusão e fadiga) se projetam juntas no lado positivo do primeiro componente, que funciona como um eixo geral de perturbação, ao passo que o vigor aponta em sentido oposto. Essa oposição entre o vigor e as dimensões de perturbação reforça, por via independente, a centralidade do eixo energia–fadiga.</w:t>
+      </w:r>
+    </w:p>
+    <w:p>
+      <w:pPr>
+        <w:spacing w:before="120"/>
+        <w:jc w:val="center"/>
+      </w:pPr>
+      <w:r>
+        <w:drawing>
+          <wp:inline xmlns:a="http://schemas.openxmlformats.org/drawingml/2006/main" xmlns:pic="http://schemas.openxmlformats.org/drawingml/2006/picture">
+            <wp:extent cx="4140000" cy="3942857"/>
+            <wp:docPr id="10" name="Picture 10"/>
+            <wp:cNvGraphicFramePr>
+              <a:graphicFrameLocks noChangeAspect="1"/>
+            </wp:cNvGraphicFramePr>
+            <a:graphic>
+              <a:graphicData uri="http://schemas.openxmlformats.org/drawingml/2006/picture">
+                <pic:pic>
+                  <pic:nvPicPr>
+                    <pic:cNvPr id="0" name="pca_circulo.png"/>
+                    <pic:cNvPicPr/>
+                  </pic:nvPicPr>
+                  <pic:blipFill>
+                    <a:blip r:embed="rId18"/>
+                    <a:stretch>
+                      <a:fillRect/>
+                    </a:stretch>
+                  </pic:blipFill>
+                  <pic:spPr>
+                    <a:xfrm>
+                      <a:off x="0" y="0"/>
+                      <a:ext cx="4140000" cy="3942857"/>
+                    </a:xfrm>
+                    <a:prstGeom prst="rect"/>
+                  </pic:spPr>
+                </pic:pic>
+              </a:graphicData>
+            </a:graphic>
+          </wp:inline>
+        </w:drawing>
+      </w:r>
+    </w:p>
+    <w:p>
+      <w:pPr>
+        <w:spacing w:after="120"/>
+        <w:jc w:val="center"/>
+      </w:pPr>
+      <w:r>
+        <w:rPr>
+          <w:rFonts w:ascii="Palatino Linotype" w:hAnsi="Palatino Linotype"/>
+          <w:b/>
+          <w:sz w:val="18"/>
+        </w:rPr>
+        <w:t xml:space="preserve">Figura 10. </w:t>
+      </w:r>
+      <w:r>
+        <w:rPr>
+          <w:rFonts w:ascii="Palatino Linotype" w:hAnsi="Palatino Linotype"/>
+          <w:sz w:val="18"/>
+        </w:rPr>
+        <w:t>Círculo de correlação da análise de componentes principais das seis dimensões do BRUMS. A espessura de cada seta é proporcional à contribuição da variável ao plano dos dois primeiros componentes.</w:t>
       </w:r>
     </w:p>
     <w:p>

</xml_diff>

<commit_message>
Signal means on the box plot and clean the function graphs
Mark the mean of each group on the significance box plot with a diamond,
a dashed line and a value label. Redraw the line and curve figures
(smoothed derivatives, daily trajectory, pre/post, marginal means) on a
white background without gridlines and with thick lines. Shrink the tall
figures to reduce page gaps; both papers now run to seventeen pages.

Co-Authored-By: Claude Opus 4.8 <noreply@anthropic.com>
Claude-Session: https://claude.ai/code/session_01P7yGiDeoGDyjWvPWQVsUrj
</commit_message>
<xml_diff>
--- a/Artigos/Paper1_Humor_MDPI.docx
+++ b/Artigos/Paper1_Humor_MDPI.docx
@@ -7247,7 +7247,7 @@
       <w:r>
         <w:drawing>
           <wp:inline xmlns:a="http://schemas.openxmlformats.org/drawingml/2006/main" xmlns:pic="http://schemas.openxmlformats.org/drawingml/2006/picture">
-            <wp:extent cx="4500000" cy="3540000"/>
+            <wp:extent cx="4500000" cy="2884615"/>
             <wp:docPr id="4" name="Picture 4"/>
             <wp:cNvGraphicFramePr>
               <a:graphicFrameLocks noChangeAspect="1"/>
@@ -7268,7 +7268,7 @@
                   <pic:spPr>
                     <a:xfrm>
                       <a:off x="0" y="0"/>
-                      <a:ext cx="4500000" cy="3540000"/>
+                      <a:ext cx="4500000" cy="2884615"/>
                     </a:xfrm>
                     <a:prstGeom prst="rect"/>
                   </pic:spPr>
@@ -7475,7 +7475,7 @@
       <w:r>
         <w:drawing>
           <wp:inline xmlns:a="http://schemas.openxmlformats.org/drawingml/2006/main" xmlns:pic="http://schemas.openxmlformats.org/drawingml/2006/picture">
-            <wp:extent cx="4500000" cy="3540000"/>
+            <wp:extent cx="3780000" cy="2423077"/>
             <wp:docPr id="7" name="Picture 7"/>
             <wp:cNvGraphicFramePr>
               <a:graphicFrameLocks noChangeAspect="1"/>
@@ -7496,7 +7496,7 @@
                   <pic:spPr>
                     <a:xfrm>
                       <a:off x="0" y="0"/>
-                      <a:ext cx="4500000" cy="3540000"/>
+                      <a:ext cx="3780000" cy="2423077"/>
                     </a:xfrm>
                     <a:prstGeom prst="rect"/>
                   </pic:spPr>
@@ -11095,7 +11095,7 @@
       <w:r>
         <w:drawing>
           <wp:inline xmlns:a="http://schemas.openxmlformats.org/drawingml/2006/main" xmlns:pic="http://schemas.openxmlformats.org/drawingml/2006/picture">
-            <wp:extent cx="4500000" cy="3540000"/>
+            <wp:extent cx="4500000" cy="2884615"/>
             <wp:docPr id="9" name="Picture 9"/>
             <wp:cNvGraphicFramePr>
               <a:graphicFrameLocks noChangeAspect="1"/>
@@ -11116,7 +11116,7 @@
                   <pic:spPr>
                     <a:xfrm>
                       <a:off x="0" y="0"/>
-                      <a:ext cx="4500000" cy="3540000"/>
+                      <a:ext cx="4500000" cy="2884615"/>
                     </a:xfrm>
                     <a:prstGeom prst="rect"/>
                   </pic:spPr>

</xml_diff>

<commit_message>
Integrate violin, ECDF and group regression; add zoom demo
Integrate three techniques into both papers with scales focused on the
interpretable range: a violin-plus-box-plus-mean of total mood disturbance
by day, an empirical cumulative distribution comparing days one, four and
seven, and a vigor-fatigue regression by microcycle phase showing tighter
coupling under accumulated load. Add a zoom (inset) figure of the
accumulation phase as a delivered demonstration.

Co-Authored-By: Claude Opus 4.8 <noreply@anthropic.com>
Claude-Session: https://claude.ai/code/session_01P7yGiDeoGDyjWvPWQVsUrj
</commit_message>
<xml_diff>
--- a/Artigos/Paper1_Humor_MDPI.docx
+++ b/Artigos/Paper1_Humor_MDPI.docx
@@ -7440,6 +7440,144 @@
     </w:p>
     <w:p>
       <w:pPr>
+        <w:spacing w:line="276" w:lineRule="auto" w:after="0"/>
+        <w:ind w:firstLine="283"/>
+        <w:jc w:val="both"/>
+      </w:pPr>
+      <w:r>
+        <w:rPr>
+          <w:rFonts w:ascii="Palatino Linotype" w:hAnsi="Palatino Linotype"/>
+          <w:b w:val="0"/>
+          <w:i w:val="0"/>
+          <w:sz w:val="20"/>
+        </w:rPr>
+        <w:t>A distribuição completa da PTH em cada dia (Figura 7) e a sua distribuição acumulada (Figura 8) confirmam o deslocamento ao longo da semana. Os diagramas de violino mostram a densidade da PTH a subir do Dia 1 ao Dia 7, e as curvas de distribuição acumulada revelam um deslocamento sistemático para a direita, com o Dia 7 situado acima do Dia 1 em praticamente toda a faixa de escores.</w:t>
+      </w:r>
+    </w:p>
+    <w:p>
+      <w:pPr>
+        <w:spacing w:before="120"/>
+        <w:jc w:val="center"/>
+      </w:pPr>
+      <w:r>
+        <w:drawing>
+          <wp:inline xmlns:a="http://schemas.openxmlformats.org/drawingml/2006/main" xmlns:pic="http://schemas.openxmlformats.org/drawingml/2006/picture">
+            <wp:extent cx="4860000" cy="2846571"/>
+            <wp:docPr id="7" name="Picture 7"/>
+            <wp:cNvGraphicFramePr>
+              <a:graphicFrameLocks noChangeAspect="1"/>
+            </wp:cNvGraphicFramePr>
+            <a:graphic>
+              <a:graphicData uri="http://schemas.openxmlformats.org/drawingml/2006/picture">
+                <pic:pic>
+                  <pic:nvPicPr>
+                    <pic:cNvPr id="0" name="tec_violin.png"/>
+                    <pic:cNvPicPr/>
+                  </pic:nvPicPr>
+                  <pic:blipFill>
+                    <a:blip r:embed="rId15"/>
+                    <a:stretch>
+                      <a:fillRect/>
+                    </a:stretch>
+                  </pic:blipFill>
+                  <pic:spPr>
+                    <a:xfrm>
+                      <a:off x="0" y="0"/>
+                      <a:ext cx="4860000" cy="2846571"/>
+                    </a:xfrm>
+                    <a:prstGeom prst="rect"/>
+                  </pic:spPr>
+                </pic:pic>
+              </a:graphicData>
+            </a:graphic>
+          </wp:inline>
+        </w:drawing>
+      </w:r>
+    </w:p>
+    <w:p>
+      <w:pPr>
+        <w:spacing w:after="120"/>
+        <w:jc w:val="center"/>
+      </w:pPr>
+      <w:r>
+        <w:rPr>
+          <w:rFonts w:ascii="Palatino Linotype" w:hAnsi="Palatino Linotype"/>
+          <w:b/>
+          <w:sz w:val="18"/>
+        </w:rPr>
+        <w:t xml:space="preserve">Figura 7. </w:t>
+      </w:r>
+      <w:r>
+        <w:rPr>
+          <w:rFonts w:ascii="Palatino Linotype" w:hAnsi="Palatino Linotype"/>
+          <w:sz w:val="18"/>
+        </w:rPr>
+        <w:t>Distribuição da PTH por dia (diagramas de violino com caixa e média; a escala foi ajustada à faixa central da distribuição para facilitar a leitura).</w:t>
+      </w:r>
+    </w:p>
+    <w:p>
+      <w:pPr>
+        <w:spacing w:before="120"/>
+        <w:jc w:val="center"/>
+      </w:pPr>
+      <w:r>
+        <w:drawing>
+          <wp:inline xmlns:a="http://schemas.openxmlformats.org/drawingml/2006/main" xmlns:pic="http://schemas.openxmlformats.org/drawingml/2006/picture">
+            <wp:extent cx="4680000" cy="2674286"/>
+            <wp:docPr id="8" name="Picture 8"/>
+            <wp:cNvGraphicFramePr>
+              <a:graphicFrameLocks noChangeAspect="1"/>
+            </wp:cNvGraphicFramePr>
+            <a:graphic>
+              <a:graphicData uri="http://schemas.openxmlformats.org/drawingml/2006/picture">
+                <pic:pic>
+                  <pic:nvPicPr>
+                    <pic:cNvPr id="0" name="tec_ecdf.png"/>
+                    <pic:cNvPicPr/>
+                  </pic:nvPicPr>
+                  <pic:blipFill>
+                    <a:blip r:embed="rId16"/>
+                    <a:stretch>
+                      <a:fillRect/>
+                    </a:stretch>
+                  </pic:blipFill>
+                  <pic:spPr>
+                    <a:xfrm>
+                      <a:off x="0" y="0"/>
+                      <a:ext cx="4680000" cy="2674286"/>
+                    </a:xfrm>
+                    <a:prstGeom prst="rect"/>
+                  </pic:spPr>
+                </pic:pic>
+              </a:graphicData>
+            </a:graphic>
+          </wp:inline>
+        </w:drawing>
+      </w:r>
+    </w:p>
+    <w:p>
+      <w:pPr>
+        <w:spacing w:after="120"/>
+        <w:jc w:val="center"/>
+      </w:pPr>
+      <w:r>
+        <w:rPr>
+          <w:rFonts w:ascii="Palatino Linotype" w:hAnsi="Palatino Linotype"/>
+          <w:b/>
+          <w:sz w:val="18"/>
+        </w:rPr>
+        <w:t xml:space="preserve">Figura 8. </w:t>
+      </w:r>
+      <w:r>
+        <w:rPr>
+          <w:rFonts w:ascii="Palatino Linotype" w:hAnsi="Palatino Linotype"/>
+          <w:sz w:val="18"/>
+        </w:rPr>
+        <w:t>Distribuição acumulada (ECDF) da PTH no Dia 1, no Dia 4 e no Dia 7; o deslocamento das curvas para a direita indica o aumento da perturbação ao longo do microciclo.</w:t>
+      </w:r>
+    </w:p>
+    <w:p>
+      <w:pPr>
         <w:spacing w:before="160" w:after="40" w:line="276" w:lineRule="auto"/>
       </w:pPr>
       <w:r>
@@ -7464,7 +7602,7 @@
           <w:i w:val="0"/>
           <w:sz w:val="20"/>
         </w:rPr>
-        <w:t>Para separar o sinal do ruído, as trajetórias do vigor, da fadiga e da PTH foram suavizadas sobre os doze pontos pré e pós-treino por meio de uma spline, e a segunda derivada de cada curva localizou o seu ponto de inflexão, ou seja, o momento em que a concavidade muda e a taxa de variação atinge o seu limite (Figura 7; Tabela 7). Depois de removido o ruído, cada dimensão exibiu um único ponto de inflexão, situado na metade da semana (em torno do Dia 3,8), o que marca a transição entre a fase inicial de prontidão e a fase de acúmulo de carga. A curva suavizada do vigor subiu até um máximo em torno do Dia 5,0 e caiu para o seu mínimo ao fim da semana, enquanto a fadiga e a PTH percorreram o caminho inverso e atingiram os seus máximos no último dia.</w:t>
+        <w:t>Para separar o sinal do ruído, as trajetórias do vigor, da fadiga e da PTH foram suavizadas sobre os doze pontos pré e pós-treino por meio de uma spline, e a segunda derivada de cada curva localizou o seu ponto de inflexão, ou seja, o momento em que a concavidade muda e a taxa de variação atinge o seu limite (Figura 9; Tabela 7). Depois de removido o ruído, cada dimensão exibiu um único ponto de inflexão, situado na metade da semana (em torno do Dia 3,8), o que marca a transição entre a fase inicial de prontidão e a fase de acúmulo de carga. A curva suavizada do vigor subiu até um máximo em torno do Dia 5,0 e caiu para o seu mínimo ao fim da semana, enquanto a fadiga e a PTH percorreram o caminho inverso e atingiram os seus máximos no último dia.</w:t>
       </w:r>
     </w:p>
     <w:p>
@@ -7476,7 +7614,7 @@
         <w:drawing>
           <wp:inline xmlns:a="http://schemas.openxmlformats.org/drawingml/2006/main" xmlns:pic="http://schemas.openxmlformats.org/drawingml/2006/picture">
             <wp:extent cx="3780000" cy="2423077"/>
-            <wp:docPr id="7" name="Picture 7"/>
+            <wp:docPr id="9" name="Picture 9"/>
             <wp:cNvGraphicFramePr>
               <a:graphicFrameLocks noChangeAspect="1"/>
             </wp:cNvGraphicFramePr>
@@ -7488,7 +7626,7 @@
                     <pic:cNvPicPr/>
                   </pic:nvPicPr>
                   <pic:blipFill>
-                    <a:blip r:embed="rId15"/>
+                    <a:blip r:embed="rId17"/>
                     <a:stretch>
                       <a:fillRect/>
                     </a:stretch>
@@ -7518,7 +7656,7 @@
           <w:b/>
           <w:sz w:val="18"/>
         </w:rPr>
-        <w:t xml:space="preserve">Figura 7. </w:t>
+        <w:t xml:space="preserve">Figura 9. </w:t>
       </w:r>
       <w:r>
         <w:rPr>
@@ -8924,7 +9062,7 @@
           <w:i w:val="0"/>
           <w:sz w:val="20"/>
         </w:rPr>
-        <w:t>No pós-teste que compara todos os dias entre si (Tabela 9; Figura 8), o vigor diferiu de forma significativa em 9 dos 21 pares de dias e a fadiga em 6, sempre no sentido de piora em relação aos primeiros dias, o que confirma a deterioração progressiva do eixo energia–fadiga.</w:t>
+        <w:t>No pós-teste que compara todos os dias entre si (Tabela 9; Figura 10), o vigor diferiu de forma significativa em 9 dos 21 pares de dias e a fadiga em 6, sempre no sentido de piora em relação aos primeiros dias, o que confirma a deterioração progressiva do eixo energia–fadiga.</w:t>
       </w:r>
     </w:p>
     <w:p>
@@ -9583,7 +9721,7 @@
         <w:drawing>
           <wp:inline xmlns:a="http://schemas.openxmlformats.org/drawingml/2006/main" xmlns:pic="http://schemas.openxmlformats.org/drawingml/2006/picture">
             <wp:extent cx="5220000" cy="2644800"/>
-            <wp:docPr id="8" name="Picture 8"/>
+            <wp:docPr id="10" name="Picture 10"/>
             <wp:cNvGraphicFramePr>
               <a:graphicFrameLocks noChangeAspect="1"/>
             </wp:cNvGraphicFramePr>
@@ -9595,7 +9733,7 @@
                     <pic:cNvPicPr/>
                   </pic:nvPicPr>
                   <pic:blipFill>
-                    <a:blip r:embed="rId16"/>
+                    <a:blip r:embed="rId18"/>
                     <a:stretch>
                       <a:fillRect/>
                     </a:stretch>
@@ -9625,7 +9763,7 @@
           <w:b/>
           <w:sz w:val="18"/>
         </w:rPr>
-        <w:t xml:space="preserve">Figura 8. </w:t>
+        <w:t xml:space="preserve">Figura 10. </w:t>
       </w:r>
       <w:r>
         <w:rPr>
@@ -11096,7 +11234,7 @@
         <w:drawing>
           <wp:inline xmlns:a="http://schemas.openxmlformats.org/drawingml/2006/main" xmlns:pic="http://schemas.openxmlformats.org/drawingml/2006/picture">
             <wp:extent cx="4500000" cy="2884615"/>
-            <wp:docPr id="9" name="Picture 9"/>
+            <wp:docPr id="11" name="Picture 11"/>
             <wp:cNvGraphicFramePr>
               <a:graphicFrameLocks noChangeAspect="1"/>
             </wp:cNvGraphicFramePr>
@@ -11108,7 +11246,7 @@
                     <pic:cNvPicPr/>
                   </pic:nvPicPr>
                   <pic:blipFill>
-                    <a:blip r:embed="rId17"/>
+                    <a:blip r:embed="rId19"/>
                     <a:stretch>
                       <a:fillRect/>
                     </a:stretch>
@@ -11138,7 +11276,7 @@
           <w:b/>
           <w:sz w:val="18"/>
         </w:rPr>
-        <w:t xml:space="preserve">Figura 9. </w:t>
+        <w:t xml:space="preserve">Figura 11. </w:t>
       </w:r>
       <w:r>
         <w:rPr>
@@ -11752,6 +11890,83 @@
     </w:p>
     <w:p>
       <w:pPr>
+        <w:spacing w:line="276" w:lineRule="auto" w:after="0"/>
+        <w:ind w:firstLine="283"/>
+        <w:jc w:val="both"/>
+      </w:pPr>
+      <w:r>
+        <w:rPr>
+          <w:rFonts w:ascii="Palatino Linotype" w:hAnsi="Palatino Linotype"/>
+          <w:b w:val="0"/>
+          <w:i w:val="0"/>
+          <w:sz w:val="20"/>
+        </w:rPr>
+        <w:t>A relação entre o vigor e a fadiga, além de negativa, tornou-se mais estreita à medida que a carga se acumulou (Figura 12): a regressão por fase do microciclo mostrou um acoplamento fraco na fase inicial (r = -0,35) e mais forte na fase de acúmulo (r = -0,51), o que sugere que os dois polos do eixo energia–fadiga passam a variar de forma mais solidária sob fadiga acumulada.</w:t>
+      </w:r>
+    </w:p>
+    <w:p>
+      <w:pPr>
+        <w:spacing w:before="120"/>
+        <w:jc w:val="center"/>
+      </w:pPr>
+      <w:r>
+        <w:drawing>
+          <wp:inline xmlns:a="http://schemas.openxmlformats.org/drawingml/2006/main" xmlns:pic="http://schemas.openxmlformats.org/drawingml/2006/picture">
+            <wp:extent cx="4500000" cy="2976923"/>
+            <wp:docPr id="12" name="Picture 12"/>
+            <wp:cNvGraphicFramePr>
+              <a:graphicFrameLocks noChangeAspect="1"/>
+            </wp:cNvGraphicFramePr>
+            <a:graphic>
+              <a:graphicData uri="http://schemas.openxmlformats.org/drawingml/2006/picture">
+                <pic:pic>
+                  <pic:nvPicPr>
+                    <pic:cNvPr id="0" name="tec_regr.png"/>
+                    <pic:cNvPicPr/>
+                  </pic:nvPicPr>
+                  <pic:blipFill>
+                    <a:blip r:embed="rId20"/>
+                    <a:stretch>
+                      <a:fillRect/>
+                    </a:stretch>
+                  </pic:blipFill>
+                  <pic:spPr>
+                    <a:xfrm>
+                      <a:off x="0" y="0"/>
+                      <a:ext cx="4500000" cy="2976923"/>
+                    </a:xfrm>
+                    <a:prstGeom prst="rect"/>
+                  </pic:spPr>
+                </pic:pic>
+              </a:graphicData>
+            </a:graphic>
+          </wp:inline>
+        </w:drawing>
+      </w:r>
+    </w:p>
+    <w:p>
+      <w:pPr>
+        <w:spacing w:after="120"/>
+        <w:jc w:val="center"/>
+      </w:pPr>
+      <w:r>
+        <w:rPr>
+          <w:rFonts w:ascii="Palatino Linotype" w:hAnsi="Palatino Linotype"/>
+          <w:b/>
+          <w:sz w:val="18"/>
+        </w:rPr>
+        <w:t xml:space="preserve">Figura 12. </w:t>
+      </w:r>
+      <w:r>
+        <w:rPr>
+          <w:rFonts w:ascii="Palatino Linotype" w:hAnsi="Palatino Linotype"/>
+          <w:sz w:val="18"/>
+        </w:rPr>
+        <w:t>Relação entre vigor e fadiga por fase do microciclo, com a reta de regressão de cada grupo (início: dias 1 a 4; acúmulo: dias 5 a 7).</w:t>
+      </w:r>
+    </w:p>
+    <w:p>
+      <w:pPr>
         <w:spacing w:before="160" w:after="40" w:line="276" w:lineRule="auto"/>
       </w:pPr>
       <w:r>
@@ -11776,7 +11991,7 @@
           <w:i w:val="0"/>
           <w:sz w:val="20"/>
         </w:rPr>
-        <w:t>Uma análise exploratória de componentes principais resumiu a estrutura das seis dimensões. Os dois primeiros componentes explicaram 64% da variância (41% no primeiro e 23% no segundo). O círculo de correlação (Figura 10) mostra que as dimensões negativas (depressão, raiva, confusão e fadiga) se projetam juntas no lado positivo do primeiro componente, que funciona como um eixo geral de perturbação, ao passo que o vigor aponta em sentido oposto. Essa oposição entre o vigor e as dimensões de perturbação reforça, por via independente, a centralidade do eixo energia–fadiga.</w:t>
+        <w:t>Uma análise exploratória de componentes principais resumiu a estrutura das seis dimensões. Os dois primeiros componentes explicaram 64% da variância (41% no primeiro e 23% no segundo). O círculo de correlação (Figura 13) mostra que as dimensões negativas (depressão, raiva, confusão e fadiga) se projetam juntas no lado positivo do primeiro componente, que funciona como um eixo geral de perturbação, ao passo que o vigor aponta em sentido oposto. Essa oposição entre o vigor e as dimensões de perturbação reforça, por via independente, a centralidade do eixo energia–fadiga.</w:t>
       </w:r>
     </w:p>
     <w:p>
@@ -11788,7 +12003,7 @@
         <w:drawing>
           <wp:inline xmlns:a="http://schemas.openxmlformats.org/drawingml/2006/main" xmlns:pic="http://schemas.openxmlformats.org/drawingml/2006/picture">
             <wp:extent cx="4140000" cy="3942857"/>
-            <wp:docPr id="10" name="Picture 10"/>
+            <wp:docPr id="13" name="Picture 13"/>
             <wp:cNvGraphicFramePr>
               <a:graphicFrameLocks noChangeAspect="1"/>
             </wp:cNvGraphicFramePr>
@@ -11800,7 +12015,7 @@
                     <pic:cNvPicPr/>
                   </pic:nvPicPr>
                   <pic:blipFill>
-                    <a:blip r:embed="rId18"/>
+                    <a:blip r:embed="rId21"/>
                     <a:stretch>
                       <a:fillRect/>
                     </a:stretch>
@@ -11830,7 +12045,7 @@
           <w:b/>
           <w:sz w:val="18"/>
         </w:rPr>
-        <w:t xml:space="preserve">Figura 10. </w:t>
+        <w:t xml:space="preserve">Figura 13. </w:t>
       </w:r>
       <w:r>
         <w:rPr>

</xml_diff>

<commit_message>
Separar corpo e Material Suplementar nos dois artigos
Move seis figuras de detalhe (box por dia, PTH par a par, violino,
distribuicao acumulada, medias marginais e pre/pos-treino) para um bloco
Material Suplementar (Figuras S1 a S6), mantendo sete figuras principais
no corpo. Ajusta as referencias no texto para o prefixo S e adiciona a
declaracao de materiais suplementares. Reduz o corpo para extensao
publicavel, com o suplementar a partir da pagina 16.

Co-Authored-By: Claude Opus 4.8 <noreply@anthropic.com>
Claude-Session: https://claude.ai/code/session_01P7yGiDeoGDyjWvPWQVsUrj
</commit_message>
<xml_diff>
--- a/Artigos/Paper1_Humor_MDPI.docx
+++ b/Artigos/Paper1_Humor_MDPI.docx
@@ -2590,7 +2590,7 @@
           <w:i/>
           <w:sz w:val="16"/>
         </w:rPr>
-        <w:t>SEM = DP × √(1 − ICC); MDC = 1,65 (90%) ou 1,96 (95%) × √2 × SEM; SWC = 0,2 × DP entre atletas.</w:t>
+        <w:t>SEM = DP × √(1 - ICC); MDC = 1,65 (90%) ou 1,96 (95%) × √2 × SEM; SWC = 0,2 × DP entre atletas.</w:t>
       </w:r>
     </w:p>
     <w:p>
@@ -7236,7 +7236,7 @@
           <w:i w:val="0"/>
           <w:sz w:val="20"/>
         </w:rPr>
-        <w:t>A Figura 4 ilustra a trajetória do vigor, da fadiga e da PTH, com a queda progressiva do vigor e a elevação da fadiga em direção ao fim do microciclo, e a Figura 5 detalha, por dia, a distribuição de cada dimensão.</w:t>
+        <w:t>A Figura 4 ilustra a trajetória do vigor, da fadiga e da PTH, com a queda progressiva do vigor e a elevação da fadiga em direção ao fim do microciclo, e a Figura S1 detalha, por dia, a distribuição de cada dimensão.</w:t>
       </w:r>
     </w:p>
     <w:p>
@@ -7302,63 +7302,18 @@
     </w:p>
     <w:p>
       <w:pPr>
-        <w:spacing w:before="120"/>
-        <w:jc w:val="center"/>
-      </w:pPr>
-      <w:r>
-        <w:drawing>
-          <wp:inline xmlns:a="http://schemas.openxmlformats.org/drawingml/2006/main" xmlns:pic="http://schemas.openxmlformats.org/drawingml/2006/picture">
-            <wp:extent cx="5400000" cy="2630769"/>
-            <wp:docPr id="5" name="Picture 5"/>
-            <wp:cNvGraphicFramePr>
-              <a:graphicFrameLocks noChangeAspect="1"/>
-            </wp:cNvGraphicFramePr>
-            <a:graphic>
-              <a:graphicData uri="http://schemas.openxmlformats.org/drawingml/2006/picture">
-                <pic:pic>
-                  <pic:nvPicPr>
-                    <pic:cNvPr id="0" name="xb3_box.png"/>
-                    <pic:cNvPicPr/>
-                  </pic:nvPicPr>
-                  <pic:blipFill>
-                    <a:blip r:embed="rId13"/>
-                    <a:stretch>
-                      <a:fillRect/>
-                    </a:stretch>
-                  </pic:blipFill>
-                  <pic:spPr>
-                    <a:xfrm>
-                      <a:off x="0" y="0"/>
-                      <a:ext cx="5400000" cy="2630769"/>
-                    </a:xfrm>
-                    <a:prstGeom prst="rect"/>
-                  </pic:spPr>
-                </pic:pic>
-              </a:graphicData>
-            </a:graphic>
-          </wp:inline>
-        </w:drawing>
-      </w:r>
-    </w:p>
-    <w:p>
-      <w:pPr>
-        <w:spacing w:after="120"/>
-        <w:jc w:val="center"/>
+        <w:spacing w:line="276" w:lineRule="auto" w:after="0"/>
+        <w:ind w:firstLine="283"/>
+        <w:jc w:val="both"/>
       </w:pPr>
       <w:r>
         <w:rPr>
           <w:rFonts w:ascii="Palatino Linotype" w:hAnsi="Palatino Linotype"/>
-          <w:b/>
-          <w:sz w:val="18"/>
+          <w:b w:val="0"/>
+          <w:i w:val="0"/>
+          <w:sz w:val="20"/>
         </w:rPr>
-        <w:t xml:space="preserve">Figura 5. </w:t>
-      </w:r>
-      <w:r>
-        <w:rPr>
-          <w:rFonts w:ascii="Palatino Linotype" w:hAnsi="Palatino Linotype"/>
-          <w:sz w:val="18"/>
-        </w:rPr>
-        <w:t>Diagramas de caixa das seis dimensões do BRUMS por dia do microciclo (áreas sombreadas: início e acúmulo da semana).</w:t>
+        <w:t>A comparação direta da PTH entre três momentos do microciclo (Figura S2) ilustra a mesma tendência: a perturbação total do humor aumentou do primeiro para o último dia, e a diferença foi significativa entre o Dia 1 e o Dia 7 (p = 0,008), embora as comparações entre dias adjacentes não tenham alcançado significância.</w:t>
       </w:r>
     </w:p>
     <w:p>
@@ -7374,206 +7329,7 @@
           <w:i w:val="0"/>
           <w:sz w:val="20"/>
         </w:rPr>
-        <w:t>A comparação direta da PTH entre três momentos do microciclo (Figura 6) ilustra a mesma tendência: a perturbação total do humor aumentou do primeiro para o último dia, e a diferença foi significativa entre o Dia 1 e o Dia 7 (p = 0,008), embora as comparações entre dias adjacentes não tenham alcançado significância.</w:t>
-      </w:r>
-    </w:p>
-    <w:p>
-      <w:pPr>
-        <w:spacing w:before="120"/>
-        <w:jc w:val="center"/>
-      </w:pPr>
-      <w:r>
-        <w:drawing>
-          <wp:inline xmlns:a="http://schemas.openxmlformats.org/drawingml/2006/main" xmlns:pic="http://schemas.openxmlformats.org/drawingml/2006/picture">
-            <wp:extent cx="4680000" cy="3094839"/>
-            <wp:docPr id="6" name="Picture 6"/>
-            <wp:cNvGraphicFramePr>
-              <a:graphicFrameLocks noChangeAspect="1"/>
-            </wp:cNvGraphicFramePr>
-            <a:graphic>
-              <a:graphicData uri="http://schemas.openxmlformats.org/drawingml/2006/picture">
-                <pic:pic>
-                  <pic:nvPicPr>
-                    <pic:cNvPr id="0" name="box_signif.png"/>
-                    <pic:cNvPicPr/>
-                  </pic:nvPicPr>
-                  <pic:blipFill>
-                    <a:blip r:embed="rId14"/>
-                    <a:stretch>
-                      <a:fillRect/>
-                    </a:stretch>
-                  </pic:blipFill>
-                  <pic:spPr>
-                    <a:xfrm>
-                      <a:off x="0" y="0"/>
-                      <a:ext cx="4680000" cy="3094839"/>
-                    </a:xfrm>
-                    <a:prstGeom prst="rect"/>
-                  </pic:spPr>
-                </pic:pic>
-              </a:graphicData>
-            </a:graphic>
-          </wp:inline>
-        </w:drawing>
-      </w:r>
-    </w:p>
-    <w:p>
-      <w:pPr>
-        <w:spacing w:after="120"/>
-        <w:jc w:val="center"/>
-      </w:pPr>
-      <w:r>
-        <w:rPr>
-          <w:rFonts w:ascii="Palatino Linotype" w:hAnsi="Palatino Linotype"/>
-          <w:b/>
-          <w:sz w:val="18"/>
-        </w:rPr>
-        <w:t xml:space="preserve">Figura 6. </w:t>
-      </w:r>
-      <w:r>
-        <w:rPr>
-          <w:rFonts w:ascii="Palatino Linotype" w:hAnsi="Palatino Linotype"/>
-          <w:sz w:val="18"/>
-        </w:rPr>
-        <w:t>Perturbação total do humor (PTH) no Dia 1, no Dia 4 e no Dia 7, com as comparações par a par (teste de Mann-Whitney; * p &lt; 0,05; ** p &lt; 0,01; ns = não significativo).</w:t>
-      </w:r>
-    </w:p>
-    <w:p>
-      <w:pPr>
-        <w:spacing w:line="276" w:lineRule="auto" w:after="0"/>
-        <w:ind w:firstLine="283"/>
-        <w:jc w:val="both"/>
-      </w:pPr>
-      <w:r>
-        <w:rPr>
-          <w:rFonts w:ascii="Palatino Linotype" w:hAnsi="Palatino Linotype"/>
-          <w:b w:val="0"/>
-          <w:i w:val="0"/>
-          <w:sz w:val="20"/>
-        </w:rPr>
-        <w:t>A distribuição completa da PTH em cada dia (Figura 7) e a sua distribuição acumulada (Figura 8) confirmam o deslocamento ao longo da semana. Os diagramas de violino mostram a densidade da PTH a subir do Dia 1 ao Dia 7, e as curvas de distribuição acumulada revelam um deslocamento sistemático para a direita, com o Dia 7 situado acima do Dia 1 em praticamente toda a faixa de escores.</w:t>
-      </w:r>
-    </w:p>
-    <w:p>
-      <w:pPr>
-        <w:spacing w:before="120"/>
-        <w:jc w:val="center"/>
-      </w:pPr>
-      <w:r>
-        <w:drawing>
-          <wp:inline xmlns:a="http://schemas.openxmlformats.org/drawingml/2006/main" xmlns:pic="http://schemas.openxmlformats.org/drawingml/2006/picture">
-            <wp:extent cx="4860000" cy="2846571"/>
-            <wp:docPr id="7" name="Picture 7"/>
-            <wp:cNvGraphicFramePr>
-              <a:graphicFrameLocks noChangeAspect="1"/>
-            </wp:cNvGraphicFramePr>
-            <a:graphic>
-              <a:graphicData uri="http://schemas.openxmlformats.org/drawingml/2006/picture">
-                <pic:pic>
-                  <pic:nvPicPr>
-                    <pic:cNvPr id="0" name="tec_violin.png"/>
-                    <pic:cNvPicPr/>
-                  </pic:nvPicPr>
-                  <pic:blipFill>
-                    <a:blip r:embed="rId15"/>
-                    <a:stretch>
-                      <a:fillRect/>
-                    </a:stretch>
-                  </pic:blipFill>
-                  <pic:spPr>
-                    <a:xfrm>
-                      <a:off x="0" y="0"/>
-                      <a:ext cx="4860000" cy="2846571"/>
-                    </a:xfrm>
-                    <a:prstGeom prst="rect"/>
-                  </pic:spPr>
-                </pic:pic>
-              </a:graphicData>
-            </a:graphic>
-          </wp:inline>
-        </w:drawing>
-      </w:r>
-    </w:p>
-    <w:p>
-      <w:pPr>
-        <w:spacing w:after="120"/>
-        <w:jc w:val="center"/>
-      </w:pPr>
-      <w:r>
-        <w:rPr>
-          <w:rFonts w:ascii="Palatino Linotype" w:hAnsi="Palatino Linotype"/>
-          <w:b/>
-          <w:sz w:val="18"/>
-        </w:rPr>
-        <w:t xml:space="preserve">Figura 7. </w:t>
-      </w:r>
-      <w:r>
-        <w:rPr>
-          <w:rFonts w:ascii="Palatino Linotype" w:hAnsi="Palatino Linotype"/>
-          <w:sz w:val="18"/>
-        </w:rPr>
-        <w:t>Distribuição da PTH por dia (diagramas de violino com caixa e média; a escala foi ajustada à faixa central da distribuição para facilitar a leitura).</w:t>
-      </w:r>
-    </w:p>
-    <w:p>
-      <w:pPr>
-        <w:spacing w:before="120"/>
-        <w:jc w:val="center"/>
-      </w:pPr>
-      <w:r>
-        <w:drawing>
-          <wp:inline xmlns:a="http://schemas.openxmlformats.org/drawingml/2006/main" xmlns:pic="http://schemas.openxmlformats.org/drawingml/2006/picture">
-            <wp:extent cx="4680000" cy="2674286"/>
-            <wp:docPr id="8" name="Picture 8"/>
-            <wp:cNvGraphicFramePr>
-              <a:graphicFrameLocks noChangeAspect="1"/>
-            </wp:cNvGraphicFramePr>
-            <a:graphic>
-              <a:graphicData uri="http://schemas.openxmlformats.org/drawingml/2006/picture">
-                <pic:pic>
-                  <pic:nvPicPr>
-                    <pic:cNvPr id="0" name="tec_ecdf.png"/>
-                    <pic:cNvPicPr/>
-                  </pic:nvPicPr>
-                  <pic:blipFill>
-                    <a:blip r:embed="rId16"/>
-                    <a:stretch>
-                      <a:fillRect/>
-                    </a:stretch>
-                  </pic:blipFill>
-                  <pic:spPr>
-                    <a:xfrm>
-                      <a:off x="0" y="0"/>
-                      <a:ext cx="4680000" cy="2674286"/>
-                    </a:xfrm>
-                    <a:prstGeom prst="rect"/>
-                  </pic:spPr>
-                </pic:pic>
-              </a:graphicData>
-            </a:graphic>
-          </wp:inline>
-        </w:drawing>
-      </w:r>
-    </w:p>
-    <w:p>
-      <w:pPr>
-        <w:spacing w:after="120"/>
-        <w:jc w:val="center"/>
-      </w:pPr>
-      <w:r>
-        <w:rPr>
-          <w:rFonts w:ascii="Palatino Linotype" w:hAnsi="Palatino Linotype"/>
-          <w:b/>
-          <w:sz w:val="18"/>
-        </w:rPr>
-        <w:t xml:space="preserve">Figura 8. </w:t>
-      </w:r>
-      <w:r>
-        <w:rPr>
-          <w:rFonts w:ascii="Palatino Linotype" w:hAnsi="Palatino Linotype"/>
-          <w:sz w:val="18"/>
-        </w:rPr>
-        <w:t>Distribuição acumulada (ECDF) da PTH no Dia 1, no Dia 4 e no Dia 7; o deslocamento das curvas para a direita indica o aumento da perturbação ao longo do microciclo.</w:t>
+        <w:t>A distribuição completa da PTH em cada dia (Figura S3) e a sua distribuição acumulada (Figura S4) confirmam o deslocamento ao longo da semana. Os diagramas de violino mostram a densidade da PTH a subir do Dia 1 ao Dia 7, e as curvas de distribuição acumulada revelam um deslocamento sistemático para a direita, com o Dia 7 situado acima do Dia 1 em praticamente toda a faixa de escores.</w:t>
       </w:r>
     </w:p>
     <w:p>
@@ -7602,7 +7358,7 @@
           <w:i w:val="0"/>
           <w:sz w:val="20"/>
         </w:rPr>
-        <w:t>Para separar o sinal do ruído, as trajetórias do vigor, da fadiga e da PTH foram suavizadas sobre os doze pontos pré e pós-treino por meio de uma spline, e a segunda derivada de cada curva localizou o seu ponto de inflexão, ou seja, o momento em que a concavidade muda e a taxa de variação atinge o seu limite (Figura 9; Tabela 7). Depois de removido o ruído, cada dimensão exibiu um único ponto de inflexão, situado na metade da semana (em torno do Dia 3,8), o que marca a transição entre a fase inicial de prontidão e a fase de acúmulo de carga. A curva suavizada do vigor subiu até um máximo em torno do Dia 5,0 e caiu para o seu mínimo ao fim da semana, enquanto a fadiga e a PTH percorreram o caminho inverso e atingiram os seus máximos no último dia.</w:t>
+        <w:t>Para separar o sinal do ruído, as trajetórias do vigor, da fadiga e da PTH foram suavizadas sobre os doze pontos pré e pós-treino por meio de uma spline, e a segunda derivada de cada curva localizou o seu ponto de inflexão, ou seja, o momento em que a concavidade muda e a taxa de variação atinge o seu limite (Figura 5; Tabela 7). Depois de removido o ruído, cada dimensão exibiu um único ponto de inflexão, situado na metade da semana (em torno do Dia 3,8), o que marca a transição entre a fase inicial de prontidão e a fase de acúmulo de carga. A curva suavizada do vigor subiu até um máximo em torno do Dia 5,0 e caiu para o seu mínimo ao fim da semana, enquanto a fadiga e a PTH percorreram o caminho inverso e atingiram os seus máximos no último dia.</w:t>
       </w:r>
     </w:p>
     <w:p>
@@ -7614,7 +7370,7 @@
         <w:drawing>
           <wp:inline xmlns:a="http://schemas.openxmlformats.org/drawingml/2006/main" xmlns:pic="http://schemas.openxmlformats.org/drawingml/2006/picture">
             <wp:extent cx="3780000" cy="2423077"/>
-            <wp:docPr id="9" name="Picture 9"/>
+            <wp:docPr id="5" name="Picture 5"/>
             <wp:cNvGraphicFramePr>
               <a:graphicFrameLocks noChangeAspect="1"/>
             </wp:cNvGraphicFramePr>
@@ -7626,7 +7382,7 @@
                     <pic:cNvPicPr/>
                   </pic:nvPicPr>
                   <pic:blipFill>
-                    <a:blip r:embed="rId17"/>
+                    <a:blip r:embed="rId13"/>
                     <a:stretch>
                       <a:fillRect/>
                     </a:stretch>
@@ -7656,7 +7412,7 @@
           <w:b/>
           <w:sz w:val="18"/>
         </w:rPr>
-        <w:t xml:space="preserve">Figura 9. </w:t>
+        <w:t xml:space="preserve">Figura 5. </w:t>
       </w:r>
       <w:r>
         <w:rPr>
@@ -9062,7 +8818,7 @@
           <w:i w:val="0"/>
           <w:sz w:val="20"/>
         </w:rPr>
-        <w:t>No pós-teste que compara todos os dias entre si (Tabela 9; Figura 10), o vigor diferiu de forma significativa em 9 dos 21 pares de dias e a fadiga em 6, sempre no sentido de piora em relação aos primeiros dias, o que confirma a deterioração progressiva do eixo energia–fadiga.</w:t>
+        <w:t>No pós-teste que compara todos os dias entre si (Tabela 9; Figura S5), o vigor diferiu de forma significativa em 9 dos 21 pares de dias e a fadiga em 6, sempre no sentido de piora em relação aos primeiros dias, o que confirma a deterioração progressiva do eixo energia–fadiga.</w:t>
       </w:r>
     </w:p>
     <w:p>
@@ -9714,67 +9470,6 @@
     </w:p>
     <w:p>
       <w:pPr>
-        <w:spacing w:before="120"/>
-        <w:jc w:val="center"/>
-      </w:pPr>
-      <w:r>
-        <w:drawing>
-          <wp:inline xmlns:a="http://schemas.openxmlformats.org/drawingml/2006/main" xmlns:pic="http://schemas.openxmlformats.org/drawingml/2006/picture">
-            <wp:extent cx="5220000" cy="2644800"/>
-            <wp:docPr id="10" name="Picture 10"/>
-            <wp:cNvGraphicFramePr>
-              <a:graphicFrameLocks noChangeAspect="1"/>
-            </wp:cNvGraphicFramePr>
-            <a:graphic>
-              <a:graphicData uri="http://schemas.openxmlformats.org/drawingml/2006/picture">
-                <pic:pic>
-                  <pic:nvPicPr>
-                    <pic:cNvPr id="0" name="ph_emm.png"/>
-                    <pic:cNvPicPr/>
-                  </pic:nvPicPr>
-                  <pic:blipFill>
-                    <a:blip r:embed="rId18"/>
-                    <a:stretch>
-                      <a:fillRect/>
-                    </a:stretch>
-                  </pic:blipFill>
-                  <pic:spPr>
-                    <a:xfrm>
-                      <a:off x="0" y="0"/>
-                      <a:ext cx="5220000" cy="2644800"/>
-                    </a:xfrm>
-                    <a:prstGeom prst="rect"/>
-                  </pic:spPr>
-                </pic:pic>
-              </a:graphicData>
-            </a:graphic>
-          </wp:inline>
-        </w:drawing>
-      </w:r>
-    </w:p>
-    <w:p>
-      <w:pPr>
-        <w:spacing w:after="120"/>
-        <w:jc w:val="center"/>
-      </w:pPr>
-      <w:r>
-        <w:rPr>
-          <w:rFonts w:ascii="Palatino Linotype" w:hAnsi="Palatino Linotype"/>
-          <w:b/>
-          <w:sz w:val="18"/>
-        </w:rPr>
-        <w:t xml:space="preserve">Figura 10. </w:t>
-      </w:r>
-      <w:r>
-        <w:rPr>
-          <w:rFonts w:ascii="Palatino Linotype" w:hAnsi="Palatino Linotype"/>
-          <w:sz w:val="18"/>
-        </w:rPr>
-        <w:t>Médias marginais diárias do vigor, da fadiga e da fadiga física, com comparação de todos os dias ao Dia 1 (* p &lt; 0,05).</w:t>
-      </w:r>
-    </w:p>
-    <w:p>
-      <w:pPr>
         <w:spacing w:before="160" w:after="40" w:line="276" w:lineRule="auto"/>
       </w:pPr>
       <w:r>
@@ -9799,7 +9494,7 @@
           <w:i w:val="0"/>
           <w:sz w:val="20"/>
         </w:rPr>
-        <w:t>O teste de Wilcoxon (Tabela 10) evidenciou uma resposta aguda coerente com o esforço: o vigor caiu (d = -0,47) e a fadiga e a PTH subiram do momento pré para o pós, com efeito de magnitude pequena a moderada.</w:t>
+        <w:t>O teste de Wilcoxon (Tabela 10) evidenciou uma resposta aguda coerente com o esforço: o vigor caiu (d = -0,47) e a fadiga e a PTH subiram do momento pré para o pós, com efeito de magnitude pequena a moderada. A Figura S6 apresenta esses escores por dia e mostra que a diferença entre pré e pós-treino se mantém ao longo da semana.</w:t>
       </w:r>
     </w:p>
     <w:p>
@@ -11223,67 +10918,6 @@
           <w:sz w:val="16"/>
         </w:rPr>
         <w:t>p do teste de Wilcoxon; d = tamanho de efeito de Cohen. PTH: perturbação total do humor.</w:t>
-      </w:r>
-    </w:p>
-    <w:p>
-      <w:pPr>
-        <w:spacing w:before="120"/>
-        <w:jc w:val="center"/>
-      </w:pPr>
-      <w:r>
-        <w:drawing>
-          <wp:inline xmlns:a="http://schemas.openxmlformats.org/drawingml/2006/main" xmlns:pic="http://schemas.openxmlformats.org/drawingml/2006/picture">
-            <wp:extent cx="4500000" cy="2884615"/>
-            <wp:docPr id="11" name="Picture 11"/>
-            <wp:cNvGraphicFramePr>
-              <a:graphicFrameLocks noChangeAspect="1"/>
-            </wp:cNvGraphicFramePr>
-            <a:graphic>
-              <a:graphicData uri="http://schemas.openxmlformats.org/drawingml/2006/picture">
-                <pic:pic>
-                  <pic:nvPicPr>
-                    <pic:cNvPr id="0" name="abnt_f_prepos.png"/>
-                    <pic:cNvPicPr/>
-                  </pic:nvPicPr>
-                  <pic:blipFill>
-                    <a:blip r:embed="rId19"/>
-                    <a:stretch>
-                      <a:fillRect/>
-                    </a:stretch>
-                  </pic:blipFill>
-                  <pic:spPr>
-                    <a:xfrm>
-                      <a:off x="0" y="0"/>
-                      <a:ext cx="4500000" cy="2884615"/>
-                    </a:xfrm>
-                    <a:prstGeom prst="rect"/>
-                  </pic:spPr>
-                </pic:pic>
-              </a:graphicData>
-            </a:graphic>
-          </wp:inline>
-        </w:drawing>
-      </w:r>
-    </w:p>
-    <w:p>
-      <w:pPr>
-        <w:spacing w:after="120"/>
-        <w:jc w:val="center"/>
-      </w:pPr>
-      <w:r>
-        <w:rPr>
-          <w:rFonts w:ascii="Palatino Linotype" w:hAnsi="Palatino Linotype"/>
-          <w:b/>
-          <w:sz w:val="18"/>
-        </w:rPr>
-        <w:t xml:space="preserve">Figura 11. </w:t>
-      </w:r>
-      <w:r>
-        <w:rPr>
-          <w:rFonts w:ascii="Palatino Linotype" w:hAnsi="Palatino Linotype"/>
-          <w:sz w:val="18"/>
-        </w:rPr>
-        <w:t>Escores de vigor, fadiga e perturbação total do humor no pré e no pós-treino, por dia.</w:t>
       </w:r>
     </w:p>
     <w:p>
@@ -11901,7 +11535,7 @@
           <w:i w:val="0"/>
           <w:sz w:val="20"/>
         </w:rPr>
-        <w:t>A relação entre o vigor e a fadiga, além de negativa, tornou-se mais estreita à medida que a carga se acumulou (Figura 12): a regressão por fase do microciclo mostrou um acoplamento fraco na fase inicial (r = -0,35) e mais forte na fase de acúmulo (r = -0,51), o que sugere que os dois polos do eixo energia–fadiga passam a variar de forma mais solidária sob fadiga acumulada.</w:t>
+        <w:t>A relação entre o vigor e a fadiga, além de negativa, tornou-se mais estreita à medida que a carga se acumulou (Figura 6): a regressão por fase do microciclo mostrou um acoplamento fraco na fase inicial (r = -0,35) e mais forte na fase de acúmulo (r = -0,51), o que sugere que os dois polos do eixo energia–fadiga passam a variar de forma mais solidária sob fadiga acumulada.</w:t>
       </w:r>
     </w:p>
     <w:p>
@@ -11913,7 +11547,7 @@
         <w:drawing>
           <wp:inline xmlns:a="http://schemas.openxmlformats.org/drawingml/2006/main" xmlns:pic="http://schemas.openxmlformats.org/drawingml/2006/picture">
             <wp:extent cx="4500000" cy="2976923"/>
-            <wp:docPr id="12" name="Picture 12"/>
+            <wp:docPr id="6" name="Picture 6"/>
             <wp:cNvGraphicFramePr>
               <a:graphicFrameLocks noChangeAspect="1"/>
             </wp:cNvGraphicFramePr>
@@ -11925,7 +11559,7 @@
                     <pic:cNvPicPr/>
                   </pic:nvPicPr>
                   <pic:blipFill>
-                    <a:blip r:embed="rId20"/>
+                    <a:blip r:embed="rId14"/>
                     <a:stretch>
                       <a:fillRect/>
                     </a:stretch>
@@ -11955,7 +11589,7 @@
           <w:b/>
           <w:sz w:val="18"/>
         </w:rPr>
-        <w:t xml:space="preserve">Figura 12. </w:t>
+        <w:t xml:space="preserve">Figura 6. </w:t>
       </w:r>
       <w:r>
         <w:rPr>
@@ -11991,7 +11625,7 @@
           <w:i w:val="0"/>
           <w:sz w:val="20"/>
         </w:rPr>
-        <w:t>Uma análise exploratória de componentes principais resumiu a estrutura das seis dimensões. Os dois primeiros componentes explicaram 64% da variância (41% no primeiro e 23% no segundo). O círculo de correlação (Figura 13) mostra que as dimensões negativas (depressão, raiva, confusão e fadiga) se projetam juntas no lado positivo do primeiro componente, que funciona como um eixo geral de perturbação, ao passo que o vigor aponta em sentido oposto. Essa oposição entre o vigor e as dimensões de perturbação reforça, por via independente, a centralidade do eixo energia–fadiga.</w:t>
+        <w:t>Uma análise exploratória de componentes principais resumiu a estrutura das seis dimensões. Os dois primeiros componentes explicaram 64% da variância (41% no primeiro e 23% no segundo). O círculo de correlação (Figura 7) mostra que as dimensões negativas (depressão, raiva, confusão e fadiga) se projetam juntas no lado positivo do primeiro componente, que funciona como um eixo geral de perturbação, ao passo que o vigor aponta em sentido oposto. Essa oposição entre o vigor e as dimensões de perturbação reforça, por via independente, a centralidade do eixo energia–fadiga.</w:t>
       </w:r>
     </w:p>
     <w:p>
@@ -12003,7 +11637,7 @@
         <w:drawing>
           <wp:inline xmlns:a="http://schemas.openxmlformats.org/drawingml/2006/main" xmlns:pic="http://schemas.openxmlformats.org/drawingml/2006/picture">
             <wp:extent cx="4140000" cy="3942857"/>
-            <wp:docPr id="13" name="Picture 13"/>
+            <wp:docPr id="7" name="Picture 7"/>
             <wp:cNvGraphicFramePr>
               <a:graphicFrameLocks noChangeAspect="1"/>
             </wp:cNvGraphicFramePr>
@@ -12015,7 +11649,7 @@
                     <pic:cNvPicPr/>
                   </pic:nvPicPr>
                   <pic:blipFill>
-                    <a:blip r:embed="rId21"/>
+                    <a:blip r:embed="rId15"/>
                     <a:stretch>
                       <a:fillRect/>
                     </a:stretch>
@@ -12045,7 +11679,7 @@
           <w:b/>
           <w:sz w:val="18"/>
         </w:rPr>
-        <w:t xml:space="preserve">Figura 13. </w:t>
+        <w:t xml:space="preserve">Figura 7. </w:t>
       </w:r>
       <w:r>
         <w:rPr>
@@ -12194,6 +11828,28 @@
       <w:pPr>
         <w:spacing w:after="80"/>
       </w:pPr>
+    </w:p>
+    <w:p>
+      <w:pPr>
+        <w:spacing w:before="80" w:after="0"/>
+        <w:jc w:val="both"/>
+      </w:pPr>
+      <w:r>
+        <w:rPr>
+          <w:rFonts w:ascii="Palatino Linotype" w:hAnsi="Palatino Linotype"/>
+          <w:b/>
+          <w:i/>
+          <w:sz w:val="18"/>
+        </w:rPr>
+        <w:t xml:space="preserve">Materiais Suplementares: </w:t>
+      </w:r>
+      <w:r>
+        <w:rPr>
+          <w:rFonts w:ascii="Palatino Linotype" w:hAnsi="Palatino Linotype"/>
+          <w:sz w:val="18"/>
+        </w:rPr>
+        <w:t>As figuras suplementares (Figuras S1 a S6) estão disponíveis ao fim deste documento e detalham a distribuição diária das dimensões, as comparações par a par da PTH, os diagramas de violino e a distribuição acumulada, as médias marginais diárias e a resposta pré e pós-treino.</w:t>
+      </w:r>
     </w:p>
     <w:p>
       <w:pPr>
@@ -12801,6 +12457,401 @@
           <w:sz w:val="17"/>
         </w:rPr>
         <w:t>Ostapiuk-Karolczuk, J.; et al. Biochemical and psychological markers of fatigue and recovery in mixed martial arts athletes during strength and conditioning training. Sci. Rep. 2025, 15, 24234. https://doi.org/10.1038/s41598-025-09719-z.</w:t>
+      </w:r>
+    </w:p>
+    <w:p>
+      <w:pPr>
+        <w:spacing w:before="240" w:after="60" w:line="276" w:lineRule="auto"/>
+      </w:pPr>
+      <w:r>
+        <w:rPr>
+          <w:rFonts w:ascii="Palatino Linotype" w:hAnsi="Palatino Linotype"/>
+          <w:b/>
+          <w:sz w:val="20"/>
+        </w:rPr>
+        <w:t>Material Suplementar</w:t>
+      </w:r>
+    </w:p>
+    <w:p>
+      <w:pPr>
+        <w:spacing w:line="276" w:lineRule="auto" w:after="80"/>
+        <w:ind w:firstLine="283"/>
+        <w:jc w:val="both"/>
+      </w:pPr>
+      <w:r>
+        <w:rPr>
+          <w:rFonts w:ascii="Palatino Linotype" w:hAnsi="Palatino Linotype"/>
+          <w:b w:val="0"/>
+          <w:i w:val="0"/>
+          <w:sz w:val="20"/>
+        </w:rPr>
+        <w:t>As figuras a seguir complementam os resultados do corpo do artigo e detalham a distribuição diária, a resposta aguda pré e pós-treino e as comparações par a par.</w:t>
+      </w:r>
+    </w:p>
+    <w:p>
+      <w:pPr>
+        <w:spacing w:before="120"/>
+        <w:jc w:val="center"/>
+      </w:pPr>
+      <w:r>
+        <w:drawing>
+          <wp:inline xmlns:a="http://schemas.openxmlformats.org/drawingml/2006/main" xmlns:pic="http://schemas.openxmlformats.org/drawingml/2006/picture">
+            <wp:extent cx="5400000" cy="2630769"/>
+            <wp:docPr id="8" name="Picture 8"/>
+            <wp:cNvGraphicFramePr>
+              <a:graphicFrameLocks noChangeAspect="1"/>
+            </wp:cNvGraphicFramePr>
+            <a:graphic>
+              <a:graphicData uri="http://schemas.openxmlformats.org/drawingml/2006/picture">
+                <pic:pic>
+                  <pic:nvPicPr>
+                    <pic:cNvPr id="0" name="xb3_box.png"/>
+                    <pic:cNvPicPr/>
+                  </pic:nvPicPr>
+                  <pic:blipFill>
+                    <a:blip r:embed="rId16"/>
+                    <a:stretch>
+                      <a:fillRect/>
+                    </a:stretch>
+                  </pic:blipFill>
+                  <pic:spPr>
+                    <a:xfrm>
+                      <a:off x="0" y="0"/>
+                      <a:ext cx="5400000" cy="2630769"/>
+                    </a:xfrm>
+                    <a:prstGeom prst="rect"/>
+                  </pic:spPr>
+                </pic:pic>
+              </a:graphicData>
+            </a:graphic>
+          </wp:inline>
+        </w:drawing>
+      </w:r>
+    </w:p>
+    <w:p>
+      <w:pPr>
+        <w:spacing w:after="120"/>
+        <w:jc w:val="center"/>
+      </w:pPr>
+      <w:r>
+        <w:rPr>
+          <w:rFonts w:ascii="Palatino Linotype" w:hAnsi="Palatino Linotype"/>
+          <w:b/>
+          <w:sz w:val="18"/>
+        </w:rPr>
+        <w:t xml:space="preserve">Figura S1. </w:t>
+      </w:r>
+      <w:r>
+        <w:rPr>
+          <w:rFonts w:ascii="Palatino Linotype" w:hAnsi="Palatino Linotype"/>
+          <w:sz w:val="18"/>
+        </w:rPr>
+        <w:t>Diagramas de caixa das seis dimensões do BRUMS por dia do microciclo (áreas sombreadas: início e acúmulo da semana).</w:t>
+      </w:r>
+    </w:p>
+    <w:p>
+      <w:pPr>
+        <w:spacing w:before="120"/>
+        <w:jc w:val="center"/>
+      </w:pPr>
+      <w:r>
+        <w:drawing>
+          <wp:inline xmlns:a="http://schemas.openxmlformats.org/drawingml/2006/main" xmlns:pic="http://schemas.openxmlformats.org/drawingml/2006/picture">
+            <wp:extent cx="4680000" cy="3094839"/>
+            <wp:docPr id="9" name="Picture 9"/>
+            <wp:cNvGraphicFramePr>
+              <a:graphicFrameLocks noChangeAspect="1"/>
+            </wp:cNvGraphicFramePr>
+            <a:graphic>
+              <a:graphicData uri="http://schemas.openxmlformats.org/drawingml/2006/picture">
+                <pic:pic>
+                  <pic:nvPicPr>
+                    <pic:cNvPr id="0" name="box_signif.png"/>
+                    <pic:cNvPicPr/>
+                  </pic:nvPicPr>
+                  <pic:blipFill>
+                    <a:blip r:embed="rId17"/>
+                    <a:stretch>
+                      <a:fillRect/>
+                    </a:stretch>
+                  </pic:blipFill>
+                  <pic:spPr>
+                    <a:xfrm>
+                      <a:off x="0" y="0"/>
+                      <a:ext cx="4680000" cy="3094839"/>
+                    </a:xfrm>
+                    <a:prstGeom prst="rect"/>
+                  </pic:spPr>
+                </pic:pic>
+              </a:graphicData>
+            </a:graphic>
+          </wp:inline>
+        </w:drawing>
+      </w:r>
+    </w:p>
+    <w:p>
+      <w:pPr>
+        <w:spacing w:after="120"/>
+        <w:jc w:val="center"/>
+      </w:pPr>
+      <w:r>
+        <w:rPr>
+          <w:rFonts w:ascii="Palatino Linotype" w:hAnsi="Palatino Linotype"/>
+          <w:b/>
+          <w:sz w:val="18"/>
+        </w:rPr>
+        <w:t xml:space="preserve">Figura S2. </w:t>
+      </w:r>
+      <w:r>
+        <w:rPr>
+          <w:rFonts w:ascii="Palatino Linotype" w:hAnsi="Palatino Linotype"/>
+          <w:sz w:val="18"/>
+        </w:rPr>
+        <w:t>Perturbação total do humor (PTH) no Dia 1, no Dia 4 e no Dia 7, com as comparações par a par (teste de Mann-Whitney; * p &lt; 0,05; ** p &lt; 0,01; ns = não significativo).</w:t>
+      </w:r>
+    </w:p>
+    <w:p>
+      <w:pPr>
+        <w:spacing w:before="120"/>
+        <w:jc w:val="center"/>
+      </w:pPr>
+      <w:r>
+        <w:drawing>
+          <wp:inline xmlns:a="http://schemas.openxmlformats.org/drawingml/2006/main" xmlns:pic="http://schemas.openxmlformats.org/drawingml/2006/picture">
+            <wp:extent cx="4860000" cy="2846571"/>
+            <wp:docPr id="10" name="Picture 10"/>
+            <wp:cNvGraphicFramePr>
+              <a:graphicFrameLocks noChangeAspect="1"/>
+            </wp:cNvGraphicFramePr>
+            <a:graphic>
+              <a:graphicData uri="http://schemas.openxmlformats.org/drawingml/2006/picture">
+                <pic:pic>
+                  <pic:nvPicPr>
+                    <pic:cNvPr id="0" name="tec_violin.png"/>
+                    <pic:cNvPicPr/>
+                  </pic:nvPicPr>
+                  <pic:blipFill>
+                    <a:blip r:embed="rId18"/>
+                    <a:stretch>
+                      <a:fillRect/>
+                    </a:stretch>
+                  </pic:blipFill>
+                  <pic:spPr>
+                    <a:xfrm>
+                      <a:off x="0" y="0"/>
+                      <a:ext cx="4860000" cy="2846571"/>
+                    </a:xfrm>
+                    <a:prstGeom prst="rect"/>
+                  </pic:spPr>
+                </pic:pic>
+              </a:graphicData>
+            </a:graphic>
+          </wp:inline>
+        </w:drawing>
+      </w:r>
+    </w:p>
+    <w:p>
+      <w:pPr>
+        <w:spacing w:after="120"/>
+        <w:jc w:val="center"/>
+      </w:pPr>
+      <w:r>
+        <w:rPr>
+          <w:rFonts w:ascii="Palatino Linotype" w:hAnsi="Palatino Linotype"/>
+          <w:b/>
+          <w:sz w:val="18"/>
+        </w:rPr>
+        <w:t xml:space="preserve">Figura S3. </w:t>
+      </w:r>
+      <w:r>
+        <w:rPr>
+          <w:rFonts w:ascii="Palatino Linotype" w:hAnsi="Palatino Linotype"/>
+          <w:sz w:val="18"/>
+        </w:rPr>
+        <w:t>Distribuição da PTH por dia (diagramas de violino com caixa e média; a escala foi ajustada à faixa central da distribuição para facilitar a leitura).</w:t>
+      </w:r>
+    </w:p>
+    <w:p>
+      <w:pPr>
+        <w:spacing w:before="120"/>
+        <w:jc w:val="center"/>
+      </w:pPr>
+      <w:r>
+        <w:drawing>
+          <wp:inline xmlns:a="http://schemas.openxmlformats.org/drawingml/2006/main" xmlns:pic="http://schemas.openxmlformats.org/drawingml/2006/picture">
+            <wp:extent cx="4680000" cy="2674286"/>
+            <wp:docPr id="11" name="Picture 11"/>
+            <wp:cNvGraphicFramePr>
+              <a:graphicFrameLocks noChangeAspect="1"/>
+            </wp:cNvGraphicFramePr>
+            <a:graphic>
+              <a:graphicData uri="http://schemas.openxmlformats.org/drawingml/2006/picture">
+                <pic:pic>
+                  <pic:nvPicPr>
+                    <pic:cNvPr id="0" name="tec_ecdf.png"/>
+                    <pic:cNvPicPr/>
+                  </pic:nvPicPr>
+                  <pic:blipFill>
+                    <a:blip r:embed="rId19"/>
+                    <a:stretch>
+                      <a:fillRect/>
+                    </a:stretch>
+                  </pic:blipFill>
+                  <pic:spPr>
+                    <a:xfrm>
+                      <a:off x="0" y="0"/>
+                      <a:ext cx="4680000" cy="2674286"/>
+                    </a:xfrm>
+                    <a:prstGeom prst="rect"/>
+                  </pic:spPr>
+                </pic:pic>
+              </a:graphicData>
+            </a:graphic>
+          </wp:inline>
+        </w:drawing>
+      </w:r>
+    </w:p>
+    <w:p>
+      <w:pPr>
+        <w:spacing w:after="120"/>
+        <w:jc w:val="center"/>
+      </w:pPr>
+      <w:r>
+        <w:rPr>
+          <w:rFonts w:ascii="Palatino Linotype" w:hAnsi="Palatino Linotype"/>
+          <w:b/>
+          <w:sz w:val="18"/>
+        </w:rPr>
+        <w:t xml:space="preserve">Figura S4. </w:t>
+      </w:r>
+      <w:r>
+        <w:rPr>
+          <w:rFonts w:ascii="Palatino Linotype" w:hAnsi="Palatino Linotype"/>
+          <w:sz w:val="18"/>
+        </w:rPr>
+        <w:t>Distribuição acumulada (ECDF) da PTH no Dia 1, no Dia 4 e no Dia 7; o deslocamento das curvas para a direita indica o aumento da perturbação ao longo do microciclo.</w:t>
+      </w:r>
+    </w:p>
+    <w:p>
+      <w:pPr>
+        <w:spacing w:before="120"/>
+        <w:jc w:val="center"/>
+      </w:pPr>
+      <w:r>
+        <w:drawing>
+          <wp:inline xmlns:a="http://schemas.openxmlformats.org/drawingml/2006/main" xmlns:pic="http://schemas.openxmlformats.org/drawingml/2006/picture">
+            <wp:extent cx="5220000" cy="2644800"/>
+            <wp:docPr id="12" name="Picture 12"/>
+            <wp:cNvGraphicFramePr>
+              <a:graphicFrameLocks noChangeAspect="1"/>
+            </wp:cNvGraphicFramePr>
+            <a:graphic>
+              <a:graphicData uri="http://schemas.openxmlformats.org/drawingml/2006/picture">
+                <pic:pic>
+                  <pic:nvPicPr>
+                    <pic:cNvPr id="0" name="ph_emm.png"/>
+                    <pic:cNvPicPr/>
+                  </pic:nvPicPr>
+                  <pic:blipFill>
+                    <a:blip r:embed="rId20"/>
+                    <a:stretch>
+                      <a:fillRect/>
+                    </a:stretch>
+                  </pic:blipFill>
+                  <pic:spPr>
+                    <a:xfrm>
+                      <a:off x="0" y="0"/>
+                      <a:ext cx="5220000" cy="2644800"/>
+                    </a:xfrm>
+                    <a:prstGeom prst="rect"/>
+                  </pic:spPr>
+                </pic:pic>
+              </a:graphicData>
+            </a:graphic>
+          </wp:inline>
+        </w:drawing>
+      </w:r>
+    </w:p>
+    <w:p>
+      <w:pPr>
+        <w:spacing w:after="120"/>
+        <w:jc w:val="center"/>
+      </w:pPr>
+      <w:r>
+        <w:rPr>
+          <w:rFonts w:ascii="Palatino Linotype" w:hAnsi="Palatino Linotype"/>
+          <w:b/>
+          <w:sz w:val="18"/>
+        </w:rPr>
+        <w:t xml:space="preserve">Figura S5. </w:t>
+      </w:r>
+      <w:r>
+        <w:rPr>
+          <w:rFonts w:ascii="Palatino Linotype" w:hAnsi="Palatino Linotype"/>
+          <w:sz w:val="18"/>
+        </w:rPr>
+        <w:t>Médias marginais diárias do vigor, da fadiga e da fadiga física, com comparação de todos os dias ao Dia 1 (* p &lt; 0,05).</w:t>
+      </w:r>
+    </w:p>
+    <w:p>
+      <w:pPr>
+        <w:spacing w:before="120"/>
+        <w:jc w:val="center"/>
+      </w:pPr>
+      <w:r>
+        <w:drawing>
+          <wp:inline xmlns:a="http://schemas.openxmlformats.org/drawingml/2006/main" xmlns:pic="http://schemas.openxmlformats.org/drawingml/2006/picture">
+            <wp:extent cx="4500000" cy="2884615"/>
+            <wp:docPr id="13" name="Picture 13"/>
+            <wp:cNvGraphicFramePr>
+              <a:graphicFrameLocks noChangeAspect="1"/>
+            </wp:cNvGraphicFramePr>
+            <a:graphic>
+              <a:graphicData uri="http://schemas.openxmlformats.org/drawingml/2006/picture">
+                <pic:pic>
+                  <pic:nvPicPr>
+                    <pic:cNvPr id="0" name="abnt_f_prepos.png"/>
+                    <pic:cNvPicPr/>
+                  </pic:nvPicPr>
+                  <pic:blipFill>
+                    <a:blip r:embed="rId21"/>
+                    <a:stretch>
+                      <a:fillRect/>
+                    </a:stretch>
+                  </pic:blipFill>
+                  <pic:spPr>
+                    <a:xfrm>
+                      <a:off x="0" y="0"/>
+                      <a:ext cx="4500000" cy="2884615"/>
+                    </a:xfrm>
+                    <a:prstGeom prst="rect"/>
+                  </pic:spPr>
+                </pic:pic>
+              </a:graphicData>
+            </a:graphic>
+          </wp:inline>
+        </w:drawing>
+      </w:r>
+    </w:p>
+    <w:p>
+      <w:pPr>
+        <w:spacing w:after="120"/>
+        <w:jc w:val="center"/>
+      </w:pPr>
+      <w:r>
+        <w:rPr>
+          <w:rFonts w:ascii="Palatino Linotype" w:hAnsi="Palatino Linotype"/>
+          <w:b/>
+          <w:sz w:val="18"/>
+        </w:rPr>
+        <w:t xml:space="preserve">Figura S6. </w:t>
+      </w:r>
+      <w:r>
+        <w:rPr>
+          <w:rFonts w:ascii="Palatino Linotype" w:hAnsi="Palatino Linotype"/>
+          <w:sz w:val="18"/>
+        </w:rPr>
+        <w:t>Escores de vigor, fadiga e perturbação total do humor no pré e no pós-treino, por dia.</w:t>
       </w:r>
     </w:p>
     <w:sectPr>

</xml_diff>